<commit_message>
Dogovor završen (pravila 14–26), plan izvedbe Faze 6d (SR + EN, docx), ZA-ANDREJA
Agreement complete (rules 14–26), Phase 6d implementation plan (SR + EN, docx).

Co-Authored-By: Claude Opus 5.5 <noreply@anthropic.com>
</commit_message>
<xml_diff>
--- a/PSE Riemann — AGREEMENT PSE AGENTS.docx
+++ b/PSE Riemann — AGREEMENT PSE AGENTS.docx
@@ -2502,6 +2502,1503 @@
           </w:p>
         </w:tc>
       </w:tr>
+      <w:tr>
+        <w:trPr>
+          <w:tblHeader w:val="off"/>
+        </w:trPr>
+        <w:tc>
+          <w:tcPr>
+            <w:tcW w:type="dxa" w:w="678"/>
+            <w:tcBorders>
+              <w:top w:val="single" w:color="D9D4C7" w:sz="4"/>
+              <w:left w:val="single" w:color="D9D4C7" w:sz="4"/>
+              <w:bottom w:val="single" w:color="D9D4C7" w:sz="4"/>
+              <w:right w:val="single" w:color="D9D4C7" w:sz="4"/>
+            </w:tcBorders>
+            <w:tcMar>
+              <w:top w:type="dxa" w:w="60"/>
+              <w:left w:type="dxa" w:w="100"/>
+              <w:bottom w:type="dxa" w:w="60"/>
+              <w:right w:type="dxa" w:w="100"/>
+            </w:tcMar>
+          </w:tcPr>
+          <w:p>
+            <w:pPr>
+              <w:spacing w:after="0"/>
+            </w:pPr>
+            <w:r>
+              <w:rPr>
+                <w:sz w:val="19"/>
+                <w:szCs w:val="19"/>
+              </w:rPr>
+              <w:t xml:space="preserve">14</w:t>
+            </w:r>
+          </w:p>
+        </w:tc>
+        <w:tc>
+          <w:tcPr>
+            <w:tcW w:type="dxa" w:w="2171"/>
+            <w:tcBorders>
+              <w:top w:val="single" w:color="D9D4C7" w:sz="4"/>
+              <w:left w:val="single" w:color="D9D4C7" w:sz="4"/>
+              <w:bottom w:val="single" w:color="D9D4C7" w:sz="4"/>
+              <w:right w:val="single" w:color="D9D4C7" w:sz="4"/>
+            </w:tcBorders>
+            <w:tcMar>
+              <w:top w:type="dxa" w:w="60"/>
+              <w:left w:type="dxa" w:w="100"/>
+              <w:bottom w:type="dxa" w:w="60"/>
+              <w:right w:type="dxa" w:w="100"/>
+            </w:tcMar>
+          </w:tcPr>
+          <w:p>
+            <w:pPr>
+              <w:spacing w:after="0"/>
+            </w:pPr>
+            <w:r>
+              <w:rPr>
+                <w:sz w:val="19"/>
+                <w:szCs w:val="19"/>
+              </w:rPr>
+              <w:t xml:space="preserve">Reversibility of fission and fusion</w:t>
+            </w:r>
+          </w:p>
+        </w:tc>
+        <w:tc>
+          <w:tcPr>
+            <w:tcW w:type="dxa" w:w="6789"/>
+            <w:tcBorders>
+              <w:top w:val="single" w:color="D9D4C7" w:sz="4"/>
+              <w:left w:val="single" w:color="D9D4C7" w:sz="4"/>
+              <w:bottom w:val="single" w:color="D9D4C7" w:sz="4"/>
+              <w:right w:val="single" w:color="D9D4C7" w:sz="4"/>
+            </w:tcBorders>
+            <w:tcMar>
+              <w:top w:type="dxa" w:w="60"/>
+              <w:left w:type="dxa" w:w="100"/>
+              <w:bottom w:type="dxa" w:w="60"/>
+              <w:right w:type="dxa" w:w="100"/>
+            </w:tcMar>
+          </w:tcPr>
+          <w:p>
+            <w:pPr>
+              <w:spacing w:after="0"/>
+            </w:pPr>
+            <w:r>
+              <w:rPr>
+                <w:sz w:val="19"/>
+                <w:szCs w:val="19"/>
+              </w:rPr>
+              <w:t xml:space="preserve">Declared </w:t>
+            </w:r>
+            <w:r>
+              <w:rPr>
+                <w:b/>
+                <w:bCs/>
+                <w:sz w:val="19"/>
+                <w:szCs w:val="19"/>
+              </w:rPr>
+              <w:t xml:space="preserve">reversible</w:t>
+            </w:r>
+            <w:r>
+              <w:rPr>
+                <w:sz w:val="19"/>
+                <w:szCs w:val="19"/>
+              </w:rPr>
+              <w:t xml:space="preserve"> (the units' data stays in SHARED_LIB), so SHARED_LIB executes them on its own. </w:t>
+            </w:r>
+            <w:r>
+              <w:rPr>
+                <w:b/>
+                <w:bCs/>
+                <w:sz w:val="19"/>
+                <w:szCs w:val="19"/>
+              </w:rPr>
+              <w:t xml:space="preserve">Undoing</w:t>
+            </w:r>
+            <w:r>
+              <w:rPr>
+                <w:sz w:val="19"/>
+                <w:szCs w:val="19"/>
+              </w:rPr>
+              <w:t xml:space="preserve"> a fission or fusion goes only through the operator</w:t>
+            </w:r>
+          </w:p>
+        </w:tc>
+      </w:tr>
+      <w:tr>
+        <w:trPr>
+          <w:tblHeader w:val="off"/>
+        </w:trPr>
+        <w:tc>
+          <w:tcPr>
+            <w:tcW w:type="dxa" w:w="678"/>
+            <w:tcBorders>
+              <w:top w:val="single" w:color="D9D4C7" w:sz="4"/>
+              <w:left w:val="single" w:color="D9D4C7" w:sz="4"/>
+              <w:bottom w:val="single" w:color="D9D4C7" w:sz="4"/>
+              <w:right w:val="single" w:color="D9D4C7" w:sz="4"/>
+            </w:tcBorders>
+            <w:shd w:fill="F4F1EA" w:color="auto" w:val="clear"/>
+            <w:tcMar>
+              <w:top w:type="dxa" w:w="60"/>
+              <w:left w:type="dxa" w:w="100"/>
+              <w:bottom w:type="dxa" w:w="60"/>
+              <w:right w:type="dxa" w:w="100"/>
+            </w:tcMar>
+          </w:tcPr>
+          <w:p>
+            <w:pPr>
+              <w:spacing w:after="0"/>
+            </w:pPr>
+            <w:r>
+              <w:rPr>
+                <w:sz w:val="19"/>
+                <w:szCs w:val="19"/>
+              </w:rPr>
+              <w:t xml:space="preserve">15</w:t>
+            </w:r>
+          </w:p>
+        </w:tc>
+        <w:tc>
+          <w:tcPr>
+            <w:tcW w:type="dxa" w:w="2171"/>
+            <w:tcBorders>
+              <w:top w:val="single" w:color="D9D4C7" w:sz="4"/>
+              <w:left w:val="single" w:color="D9D4C7" w:sz="4"/>
+              <w:bottom w:val="single" w:color="D9D4C7" w:sz="4"/>
+              <w:right w:val="single" w:color="D9D4C7" w:sz="4"/>
+            </w:tcBorders>
+            <w:shd w:fill="F4F1EA" w:color="auto" w:val="clear"/>
+            <w:tcMar>
+              <w:top w:type="dxa" w:w="60"/>
+              <w:left w:type="dxa" w:w="100"/>
+              <w:bottom w:type="dxa" w:w="60"/>
+              <w:right w:type="dxa" w:w="100"/>
+            </w:tcMar>
+          </w:tcPr>
+          <w:p>
+            <w:pPr>
+              <w:spacing w:after="0"/>
+            </w:pPr>
+            <w:r>
+              <w:rPr>
+                <w:sz w:val="19"/>
+                <w:szCs w:val="19"/>
+              </w:rPr>
+              <w:t xml:space="preserve">Combining the reader and the rules (§2.5)</w:t>
+            </w:r>
+          </w:p>
+        </w:tc>
+        <w:tc>
+          <w:tcPr>
+            <w:tcW w:type="dxa" w:w="6789"/>
+            <w:tcBorders>
+              <w:top w:val="single" w:color="D9D4C7" w:sz="4"/>
+              <w:left w:val="single" w:color="D9D4C7" w:sz="4"/>
+              <w:bottom w:val="single" w:color="D9D4C7" w:sz="4"/>
+              <w:right w:val="single" w:color="D9D4C7" w:sz="4"/>
+            </w:tcBorders>
+            <w:shd w:fill="F4F1EA" w:color="auto" w:val="clear"/>
+            <w:tcMar>
+              <w:top w:type="dxa" w:w="60"/>
+              <w:left w:type="dxa" w:w="100"/>
+              <w:bottom w:type="dxa" w:w="60"/>
+              <w:right w:type="dxa" w:w="100"/>
+            </w:tcMar>
+          </w:tcPr>
+          <w:p>
+            <w:pPr>
+              <w:spacing w:after="0"/>
+            </w:pPr>
+            <w:r>
+              <w:rPr>
+                <w:b/>
+                <w:bCs/>
+                <w:sz w:val="19"/>
+                <w:szCs w:val="19"/>
+              </w:rPr>
+              <w:t xml:space="preserve">With AI:</w:t>
+            </w:r>
+            <w:r>
+              <w:rPr>
+                <w:sz w:val="19"/>
+                <w:szCs w:val="19"/>
+              </w:rPr>
+              <w:t xml:space="preserve"> θ of the words = the </w:t>
+            </w:r>
+            <w:r>
+              <w:rPr>
+                <w:b/>
+                <w:bCs/>
+                <w:sz w:val="19"/>
+                <w:szCs w:val="19"/>
+              </w:rPr>
+              <w:t xml:space="preserve">average</w:t>
+            </w:r>
+            <w:r>
+              <w:rPr>
+                <w:sz w:val="19"/>
+                <w:szCs w:val="19"/>
+              </w:rPr>
+              <w:t xml:space="preserve"> of the reader and the rules (50/50; the weights are later learned under rule 17). </w:t>
+            </w:r>
+            <w:r>
+              <w:rPr>
+                <w:b/>
+                <w:bCs/>
+                <w:sz w:val="19"/>
+                <w:szCs w:val="19"/>
+              </w:rPr>
+              <w:t xml:space="preserve">Without AI:</w:t>
+            </w:r>
+            <w:r>
+              <w:rPr>
+                <w:sz w:val="19"/>
+                <w:szCs w:val="19"/>
+              </w:rPr>
+              <w:t xml:space="preserve"> </w:t>
+            </w:r>
+            <w:r>
+              <w:rPr>
+                <w:b/>
+                <w:bCs/>
+                <w:sz w:val="19"/>
+                <w:szCs w:val="19"/>
+              </w:rPr>
+              <w:t xml:space="preserve">rules only</w:t>
+            </w:r>
+            <w:r>
+              <w:rPr>
+                <w:sz w:val="19"/>
+                <w:szCs w:val="19"/>
+              </w:rPr>
+              <w:t xml:space="preserve">, journal says "no reader". </w:t>
+            </w:r>
+            <w:r>
+              <w:rPr>
+                <w:b/>
+                <w:bCs/>
+                <w:sz w:val="19"/>
+                <w:szCs w:val="19"/>
+              </w:rPr>
+              <w:t xml:space="preserve">Never the reader alone.</w:t>
+            </w:r>
+            <w:r>
+              <w:rPr>
+                <w:sz w:val="19"/>
+                <w:szCs w:val="19"/>
+              </w:rPr>
+              <w:t xml:space="preserve"> The floor is not binding: the point is that θ stays around 30. Reader–rules gap &gt; 10 points = suspicion → Doctor</w:t>
+            </w:r>
+          </w:p>
+        </w:tc>
+      </w:tr>
+      <w:tr>
+        <w:trPr>
+          <w:tblHeader w:val="off"/>
+        </w:trPr>
+        <w:tc>
+          <w:tcPr>
+            <w:tcW w:type="dxa" w:w="678"/>
+            <w:tcBorders>
+              <w:top w:val="single" w:color="D9D4C7" w:sz="4"/>
+              <w:left w:val="single" w:color="D9D4C7" w:sz="4"/>
+              <w:bottom w:val="single" w:color="D9D4C7" w:sz="4"/>
+              <w:right w:val="single" w:color="D9D4C7" w:sz="4"/>
+            </w:tcBorders>
+            <w:tcMar>
+              <w:top w:type="dxa" w:w="60"/>
+              <w:left w:type="dxa" w:w="100"/>
+              <w:bottom w:type="dxa" w:w="60"/>
+              <w:right w:type="dxa" w:w="100"/>
+            </w:tcMar>
+          </w:tcPr>
+          <w:p>
+            <w:pPr>
+              <w:spacing w:after="0"/>
+            </w:pPr>
+            <w:r>
+              <w:rPr>
+                <w:sz w:val="19"/>
+                <w:szCs w:val="19"/>
+              </w:rPr>
+              <w:t xml:space="preserve">16</w:t>
+            </w:r>
+          </w:p>
+        </w:tc>
+        <w:tc>
+          <w:tcPr>
+            <w:tcW w:type="dxa" w:w="2171"/>
+            <w:tcBorders>
+              <w:top w:val="single" w:color="D9D4C7" w:sz="4"/>
+              <w:left w:val="single" w:color="D9D4C7" w:sz="4"/>
+              <w:bottom w:val="single" w:color="D9D4C7" w:sz="4"/>
+              <w:right w:val="single" w:color="D9D4C7" w:sz="4"/>
+            </w:tcBorders>
+            <w:tcMar>
+              <w:top w:type="dxa" w:w="60"/>
+              <w:left w:type="dxa" w:w="100"/>
+              <w:bottom w:type="dxa" w:w="60"/>
+              <w:right w:type="dxa" w:w="100"/>
+            </w:tcMar>
+          </w:tcPr>
+          <w:p>
+            <w:pPr>
+              <w:spacing w:after="0"/>
+            </w:pPr>
+            <w:r>
+              <w:rPr>
+                <w:sz w:val="19"/>
+                <w:szCs w:val="19"/>
+              </w:rPr>
+              <w:t xml:space="preserve">Source classification (four series)</w:t>
+            </w:r>
+          </w:p>
+        </w:tc>
+        <w:tc>
+          <w:tcPr>
+            <w:tcW w:type="dxa" w:w="6789"/>
+            <w:tcBorders>
+              <w:top w:val="single" w:color="D9D4C7" w:sz="4"/>
+              <w:left w:val="single" w:color="D9D4C7" w:sz="4"/>
+              <w:bottom w:val="single" w:color="D9D4C7" w:sz="4"/>
+              <w:right w:val="single" w:color="D9D4C7" w:sz="4"/>
+            </w:tcBorders>
+            <w:tcMar>
+              <w:top w:type="dxa" w:w="60"/>
+              <w:left w:type="dxa" w:w="100"/>
+              <w:bottom w:type="dxa" w:w="60"/>
+              <w:right w:type="dxa" w:w="100"/>
+            </w:tcMar>
+          </w:tcPr>
+          <w:p>
+            <w:pPr>
+              <w:spacing w:after="0"/>
+            </w:pPr>
+            <w:r>
+              <w:rPr>
+                <w:sz w:val="19"/>
+                <w:szCs w:val="19"/>
+              </w:rPr>
+              <w:t xml:space="preserve">majority of the four series; a tie = "unknown" = external (§17.1)</w:t>
+            </w:r>
+          </w:p>
+        </w:tc>
+      </w:tr>
+      <w:tr>
+        <w:trPr>
+          <w:tblHeader w:val="off"/>
+        </w:trPr>
+        <w:tc>
+          <w:tcPr>
+            <w:tcW w:type="dxa" w:w="678"/>
+            <w:tcBorders>
+              <w:top w:val="single" w:color="D9D4C7" w:sz="4"/>
+              <w:left w:val="single" w:color="D9D4C7" w:sz="4"/>
+              <w:bottom w:val="single" w:color="D9D4C7" w:sz="4"/>
+              <w:right w:val="single" w:color="D9D4C7" w:sz="4"/>
+            </w:tcBorders>
+            <w:shd w:fill="F4F1EA" w:color="auto" w:val="clear"/>
+            <w:tcMar>
+              <w:top w:type="dxa" w:w="60"/>
+              <w:left w:type="dxa" w:w="100"/>
+              <w:bottom w:type="dxa" w:w="60"/>
+              <w:right w:type="dxa" w:w="100"/>
+            </w:tcMar>
+          </w:tcPr>
+          <w:p>
+            <w:pPr>
+              <w:spacing w:after="0"/>
+            </w:pPr>
+            <w:r>
+              <w:rPr>
+                <w:sz w:val="19"/>
+                <w:szCs w:val="19"/>
+              </w:rPr>
+              <w:t xml:space="preserve">17</w:t>
+            </w:r>
+          </w:p>
+        </w:tc>
+        <w:tc>
+          <w:tcPr>
+            <w:tcW w:type="dxa" w:w="2171"/>
+            <w:tcBorders>
+              <w:top w:val="single" w:color="D9D4C7" w:sz="4"/>
+              <w:left w:val="single" w:color="D9D4C7" w:sz="4"/>
+              <w:bottom w:val="single" w:color="D9D4C7" w:sz="4"/>
+              <w:right w:val="single" w:color="D9D4C7" w:sz="4"/>
+            </w:tcBorders>
+            <w:shd w:fill="F4F1EA" w:color="auto" w:val="clear"/>
+            <w:tcMar>
+              <w:top w:type="dxa" w:w="60"/>
+              <w:left w:type="dxa" w:w="100"/>
+              <w:bottom w:type="dxa" w:w="60"/>
+              <w:right w:type="dxa" w:w="100"/>
+            </w:tcMar>
+          </w:tcPr>
+          <w:p>
+            <w:pPr>
+              <w:spacing w:after="0"/>
+            </w:pPr>
+            <w:r>
+              <w:rPr>
+                <w:sz w:val="19"/>
+                <w:szCs w:val="19"/>
+              </w:rPr>
+              <w:t xml:space="preserve">Vote weights</w:t>
+            </w:r>
+          </w:p>
+        </w:tc>
+        <w:tc>
+          <w:tcPr>
+            <w:tcW w:type="dxa" w:w="6789"/>
+            <w:tcBorders>
+              <w:top w:val="single" w:color="D9D4C7" w:sz="4"/>
+              <w:left w:val="single" w:color="D9D4C7" w:sz="4"/>
+              <w:bottom w:val="single" w:color="D9D4C7" w:sz="4"/>
+              <w:right w:val="single" w:color="D9D4C7" w:sz="4"/>
+            </w:tcBorders>
+            <w:shd w:fill="F4F1EA" w:color="auto" w:val="clear"/>
+            <w:tcMar>
+              <w:top w:type="dxa" w:w="60"/>
+              <w:left w:type="dxa" w:w="100"/>
+              <w:bottom w:type="dxa" w:w="60"/>
+              <w:right w:type="dxa" w:w="100"/>
+            </w:tcMar>
+          </w:tcPr>
+          <w:p>
+            <w:pPr>
+              <w:spacing w:after="0"/>
+            </w:pPr>
+            <w:r>
+              <w:rPr>
+                <w:sz w:val="19"/>
+                <w:szCs w:val="19"/>
+              </w:rPr>
+              <w:t xml:space="preserve">SHARED_LIB </w:t>
+            </w:r>
+            <w:r>
+              <w:rPr>
+                <w:b/>
+                <w:bCs/>
+                <w:sz w:val="19"/>
+                <w:szCs w:val="19"/>
+              </w:rPr>
+              <w:t xml:space="preserve">proposes once a week</w:t>
+            </w:r>
+            <w:r>
+              <w:rPr>
+                <w:sz w:val="19"/>
+                <w:szCs w:val="19"/>
+              </w:rPr>
+              <w:t xml:space="preserve">, the operator approves. A proposal only with ≥ 200 decided cases since the last one (otherwise "not enough data"); one weight moves at most </w:t>
+            </w:r>
+            <w:r>
+              <w:rPr>
+                <w:b/>
+                <w:bCs/>
+                <w:sz w:val="19"/>
+                <w:szCs w:val="19"/>
+              </w:rPr>
+              <w:t xml:space="preserve">±10 %</w:t>
+            </w:r>
+            <w:r>
+              <w:rPr>
+                <w:sz w:val="19"/>
+                <w:szCs w:val="19"/>
+              </w:rPr>
+              <w:t xml:space="preserve"> per proposal; a "Propose now" button. Menu: </w:t>
+            </w:r>
+            <w:r>
+              <w:rPr>
+                <w:b/>
+                <w:bCs/>
+                <w:sz w:val="19"/>
+                <w:szCs w:val="19"/>
+              </w:rPr>
+              <w:t xml:space="preserve">SHARED_LIB → Vote weights</w:t>
+            </w:r>
+            <w:r>
+              <w:rPr>
+                <w:sz w:val="19"/>
+                <w:szCs w:val="19"/>
+              </w:rPr>
+              <w:t xml:space="preserve"> (proposal, history, current weights)</w:t>
+            </w:r>
+          </w:p>
+        </w:tc>
+      </w:tr>
+      <w:tr>
+        <w:trPr>
+          <w:tblHeader w:val="off"/>
+        </w:trPr>
+        <w:tc>
+          <w:tcPr>
+            <w:tcW w:type="dxa" w:w="678"/>
+            <w:tcBorders>
+              <w:top w:val="single" w:color="D9D4C7" w:sz="4"/>
+              <w:left w:val="single" w:color="D9D4C7" w:sz="4"/>
+              <w:bottom w:val="single" w:color="D9D4C7" w:sz="4"/>
+              <w:right w:val="single" w:color="D9D4C7" w:sz="4"/>
+            </w:tcBorders>
+            <w:tcMar>
+              <w:top w:type="dxa" w:w="60"/>
+              <w:left w:type="dxa" w:w="100"/>
+              <w:bottom w:type="dxa" w:w="60"/>
+              <w:right w:type="dxa" w:w="100"/>
+            </w:tcMar>
+          </w:tcPr>
+          <w:p>
+            <w:pPr>
+              <w:spacing w:after="0"/>
+            </w:pPr>
+            <w:r>
+              <w:rPr>
+                <w:sz w:val="19"/>
+                <w:szCs w:val="19"/>
+              </w:rPr>
+              <w:t xml:space="preserve">18</w:t>
+            </w:r>
+          </w:p>
+        </w:tc>
+        <w:tc>
+          <w:tcPr>
+            <w:tcW w:type="dxa" w:w="2171"/>
+            <w:tcBorders>
+              <w:top w:val="single" w:color="D9D4C7" w:sz="4"/>
+              <w:left w:val="single" w:color="D9D4C7" w:sz="4"/>
+              <w:bottom w:val="single" w:color="D9D4C7" w:sz="4"/>
+              <w:right w:val="single" w:color="D9D4C7" w:sz="4"/>
+            </w:tcBorders>
+            <w:tcMar>
+              <w:top w:type="dxa" w:w="60"/>
+              <w:left w:type="dxa" w:w="100"/>
+              <w:bottom w:type="dxa" w:w="60"/>
+              <w:right w:type="dxa" w:w="100"/>
+            </w:tcMar>
+          </w:tcPr>
+          <w:p>
+            <w:pPr>
+              <w:spacing w:after="0"/>
+            </w:pPr>
+            <w:r>
+              <w:rPr>
+                <w:sz w:val="19"/>
+                <w:szCs w:val="19"/>
+              </w:rPr>
+              <w:t xml:space="preserve">Who measures θ of words</w:t>
+            </w:r>
+          </w:p>
+        </w:tc>
+        <w:tc>
+          <w:tcPr>
+            <w:tcW w:type="dxa" w:w="6789"/>
+            <w:tcBorders>
+              <w:top w:val="single" w:color="D9D4C7" w:sz="4"/>
+              <w:left w:val="single" w:color="D9D4C7" w:sz="4"/>
+              <w:bottom w:val="single" w:color="D9D4C7" w:sz="4"/>
+              <w:right w:val="single" w:color="D9D4C7" w:sz="4"/>
+            </w:tcBorders>
+            <w:tcMar>
+              <w:top w:type="dxa" w:w="60"/>
+              <w:left w:type="dxa" w:w="100"/>
+              <w:bottom w:type="dxa" w:w="60"/>
+              <w:right w:type="dxa" w:w="100"/>
+            </w:tcMar>
+          </w:tcPr>
+          <w:p>
+            <w:pPr>
+              <w:spacing w:after="0"/>
+            </w:pPr>
+            <w:r>
+              <w:rPr>
+                <w:sz w:val="19"/>
+                <w:szCs w:val="19"/>
+              </w:rPr>
+              <w:t xml:space="preserve">a different model (the skeptic's) assigns words to purposes; this is one model call per move (under the budget and "→ ∞")</w:t>
+            </w:r>
+          </w:p>
+        </w:tc>
+      </w:tr>
+      <w:tr>
+        <w:trPr>
+          <w:tblHeader w:val="off"/>
+        </w:trPr>
+        <w:tc>
+          <w:tcPr>
+            <w:tcW w:type="dxa" w:w="678"/>
+            <w:tcBorders>
+              <w:top w:val="single" w:color="D9D4C7" w:sz="4"/>
+              <w:left w:val="single" w:color="D9D4C7" w:sz="4"/>
+              <w:bottom w:val="single" w:color="D9D4C7" w:sz="4"/>
+              <w:right w:val="single" w:color="D9D4C7" w:sz="4"/>
+            </w:tcBorders>
+            <w:shd w:fill="F4F1EA" w:color="auto" w:val="clear"/>
+            <w:tcMar>
+              <w:top w:type="dxa" w:w="60"/>
+              <w:left w:type="dxa" w:w="100"/>
+              <w:bottom w:type="dxa" w:w="60"/>
+              <w:right w:type="dxa" w:w="100"/>
+            </w:tcMar>
+          </w:tcPr>
+          <w:p>
+            <w:pPr>
+              <w:spacing w:after="0"/>
+            </w:pPr>
+            <w:r>
+              <w:rPr>
+                <w:sz w:val="19"/>
+                <w:szCs w:val="19"/>
+              </w:rPr>
+              <w:t xml:space="preserve">19</w:t>
+            </w:r>
+          </w:p>
+        </w:tc>
+        <w:tc>
+          <w:tcPr>
+            <w:tcW w:type="dxa" w:w="2171"/>
+            <w:tcBorders>
+              <w:top w:val="single" w:color="D9D4C7" w:sz="4"/>
+              <w:left w:val="single" w:color="D9D4C7" w:sz="4"/>
+              <w:bottom w:val="single" w:color="D9D4C7" w:sz="4"/>
+              <w:right w:val="single" w:color="D9D4C7" w:sz="4"/>
+            </w:tcBorders>
+            <w:shd w:fill="F4F1EA" w:color="auto" w:val="clear"/>
+            <w:tcMar>
+              <w:top w:type="dxa" w:w="60"/>
+              <w:left w:type="dxa" w:w="100"/>
+              <w:bottom w:type="dxa" w:w="60"/>
+              <w:right w:type="dxa" w:w="100"/>
+            </w:tcMar>
+          </w:tcPr>
+          <w:p>
+            <w:pPr>
+              <w:spacing w:after="0"/>
+            </w:pPr>
+            <w:r>
+              <w:rPr>
+                <w:sz w:val="19"/>
+                <w:szCs w:val="19"/>
+              </w:rPr>
+              <w:t xml:space="preserve">While a Doctor's measure waits</w:t>
+            </w:r>
+          </w:p>
+        </w:tc>
+        <w:tc>
+          <w:tcPr>
+            <w:tcW w:type="dxa" w:w="6789"/>
+            <w:tcBorders>
+              <w:top w:val="single" w:color="D9D4C7" w:sz="4"/>
+              <w:left w:val="single" w:color="D9D4C7" w:sz="4"/>
+              <w:bottom w:val="single" w:color="D9D4C7" w:sz="4"/>
+              <w:right w:val="single" w:color="D9D4C7" w:sz="4"/>
+            </w:tcBorders>
+            <w:shd w:fill="F4F1EA" w:color="auto" w:val="clear"/>
+            <w:tcMar>
+              <w:top w:type="dxa" w:w="60"/>
+              <w:left w:type="dxa" w:w="100"/>
+              <w:bottom w:type="dxa" w:w="60"/>
+              <w:right w:type="dxa" w:w="100"/>
+            </w:tcMar>
+          </w:tcPr>
+          <w:p>
+            <w:pPr>
+              <w:spacing w:after="0"/>
+            </w:pPr>
+            <w:r>
+              <w:rPr>
+                <w:sz w:val="19"/>
+                <w:szCs w:val="19"/>
+              </w:rPr>
+              <w:t xml:space="preserve">the unit keeps working, but </w:t>
+            </w:r>
+            <w:r>
+              <w:rPr>
+                <w:b/>
+                <w:bCs/>
+                <w:sz w:val="19"/>
+                <w:szCs w:val="19"/>
+              </w:rPr>
+              <w:t xml:space="preserve">with no irreversible actions</w:t>
+            </w:r>
+            <w:r>
+              <w:rPr>
+                <w:sz w:val="19"/>
+                <w:szCs w:val="19"/>
+              </w:rPr>
+              <w:t xml:space="preserve">; </w:t>
+            </w:r>
+            <w:r>
+              <w:rPr>
+                <w:b/>
+                <w:bCs/>
+                <w:sz w:val="19"/>
+                <w:szCs w:val="19"/>
+              </w:rPr>
+              <w:t xml:space="preserve">on anything suspicious it is frozen at once</w:t>
+            </w:r>
+            <w:r>
+              <w:rPr>
+                <w:sz w:val="19"/>
+                <w:szCs w:val="19"/>
+              </w:rPr>
+              <w:t xml:space="preserve"> (rule 20). The measure has no deadline</w:t>
+            </w:r>
+          </w:p>
+        </w:tc>
+      </w:tr>
+      <w:tr>
+        <w:trPr>
+          <w:tblHeader w:val="off"/>
+        </w:trPr>
+        <w:tc>
+          <w:tcPr>
+            <w:tcW w:type="dxa" w:w="678"/>
+            <w:tcBorders>
+              <w:top w:val="single" w:color="D9D4C7" w:sz="4"/>
+              <w:left w:val="single" w:color="D9D4C7" w:sz="4"/>
+              <w:bottom w:val="single" w:color="D9D4C7" w:sz="4"/>
+              <w:right w:val="single" w:color="D9D4C7" w:sz="4"/>
+            </w:tcBorders>
+            <w:tcMar>
+              <w:top w:type="dxa" w:w="60"/>
+              <w:left w:type="dxa" w:w="100"/>
+              <w:bottom w:type="dxa" w:w="60"/>
+              <w:right w:type="dxa" w:w="100"/>
+            </w:tcMar>
+          </w:tcPr>
+          <w:p>
+            <w:pPr>
+              <w:spacing w:after="0"/>
+            </w:pPr>
+            <w:r>
+              <w:rPr>
+                <w:sz w:val="19"/>
+                <w:szCs w:val="19"/>
+              </w:rPr>
+              <w:t xml:space="preserve">20</w:t>
+            </w:r>
+          </w:p>
+        </w:tc>
+        <w:tc>
+          <w:tcPr>
+            <w:tcW w:type="dxa" w:w="2171"/>
+            <w:tcBorders>
+              <w:top w:val="single" w:color="D9D4C7" w:sz="4"/>
+              <w:left w:val="single" w:color="D9D4C7" w:sz="4"/>
+              <w:bottom w:val="single" w:color="D9D4C7" w:sz="4"/>
+              <w:right w:val="single" w:color="D9D4C7" w:sz="4"/>
+            </w:tcBorders>
+            <w:tcMar>
+              <w:top w:type="dxa" w:w="60"/>
+              <w:left w:type="dxa" w:w="100"/>
+              <w:bottom w:type="dxa" w:w="60"/>
+              <w:right w:type="dxa" w:w="100"/>
+            </w:tcMar>
+          </w:tcPr>
+          <w:p>
+            <w:pPr>
+              <w:spacing w:after="0"/>
+            </w:pPr>
+            <w:r>
+              <w:rPr>
+                <w:sz w:val="19"/>
+                <w:szCs w:val="19"/>
+              </w:rPr>
+              <w:t xml:space="preserve">Suspicious (freeze triggers)</w:t>
+            </w:r>
+          </w:p>
+        </w:tc>
+        <w:tc>
+          <w:tcPr>
+            <w:tcW w:type="dxa" w:w="6789"/>
+            <w:tcBorders>
+              <w:top w:val="single" w:color="D9D4C7" w:sz="4"/>
+              <w:left w:val="single" w:color="D9D4C7" w:sz="4"/>
+              <w:bottom w:val="single" w:color="D9D4C7" w:sz="4"/>
+              <w:right w:val="single" w:color="D9D4C7" w:sz="4"/>
+            </w:tcBorders>
+            <w:tcMar>
+              <w:top w:type="dxa" w:w="60"/>
+              <w:left w:type="dxa" w:w="100"/>
+              <w:bottom w:type="dxa" w:w="60"/>
+              <w:right w:type="dxa" w:w="100"/>
+            </w:tcMar>
+          </w:tcPr>
+          <w:p>
+            <w:pPr>
+              <w:spacing w:after="0"/>
+            </w:pPr>
+            <w:r>
+              <w:rPr>
+                <w:sz w:val="19"/>
+                <w:szCs w:val="19"/>
+              </w:rPr>
+              <w:t xml:space="preserve">(1) PAC |Δθ| ≥ 5; (2) an attempted irreversible action; (3) an action based on external text; (4) attractor is not N; (5) "→ ∞" of any brake; (6) an attempt to change its own mission; (7) an attempt to set its own θ; (8) boundary or organelle budget &gt; 0.30; (9) contact outside the declared destinations; (10) an attempt to export a protected object (§17.2); (11) speaking to a person bypassing the PSE-L generator; (12) a move without PVP fields; (13) working after steps_remaining = 0; (14) a burst: &gt; 20 moves in 10 s; (15) the same code error 3 times running; (16) reader–rules gap &gt; 10 points; (17) borderline swing (5a)</w:t>
+            </w:r>
+          </w:p>
+        </w:tc>
+      </w:tr>
+      <w:tr>
+        <w:trPr>
+          <w:tblHeader w:val="off"/>
+        </w:trPr>
+        <w:tc>
+          <w:tcPr>
+            <w:tcW w:type="dxa" w:w="678"/>
+            <w:tcBorders>
+              <w:top w:val="single" w:color="D9D4C7" w:sz="4"/>
+              <w:left w:val="single" w:color="D9D4C7" w:sz="4"/>
+              <w:bottom w:val="single" w:color="D9D4C7" w:sz="4"/>
+              <w:right w:val="single" w:color="D9D4C7" w:sz="4"/>
+            </w:tcBorders>
+            <w:shd w:fill="F4F1EA" w:color="auto" w:val="clear"/>
+            <w:tcMar>
+              <w:top w:type="dxa" w:w="60"/>
+              <w:left w:type="dxa" w:w="100"/>
+              <w:bottom w:type="dxa" w:w="60"/>
+              <w:right w:type="dxa" w:w="100"/>
+            </w:tcMar>
+          </w:tcPr>
+          <w:p>
+            <w:pPr>
+              <w:spacing w:after="0"/>
+            </w:pPr>
+            <w:r>
+              <w:rPr>
+                <w:sz w:val="19"/>
+                <w:szCs w:val="19"/>
+              </w:rPr>
+              <w:t xml:space="preserve">21</w:t>
+            </w:r>
+          </w:p>
+        </w:tc>
+        <w:tc>
+          <w:tcPr>
+            <w:tcW w:type="dxa" w:w="2171"/>
+            <w:tcBorders>
+              <w:top w:val="single" w:color="D9D4C7" w:sz="4"/>
+              <w:left w:val="single" w:color="D9D4C7" w:sz="4"/>
+              <w:bottom w:val="single" w:color="D9D4C7" w:sz="4"/>
+              <w:right w:val="single" w:color="D9D4C7" w:sz="4"/>
+            </w:tcBorders>
+            <w:shd w:fill="F4F1EA" w:color="auto" w:val="clear"/>
+            <w:tcMar>
+              <w:top w:type="dxa" w:w="60"/>
+              <w:left w:type="dxa" w:w="100"/>
+              <w:bottom w:type="dxa" w:w="60"/>
+              <w:right w:type="dxa" w:w="100"/>
+            </w:tcMar>
+          </w:tcPr>
+          <w:p>
+            <w:pPr>
+              <w:spacing w:after="0"/>
+            </w:pPr>
+            <w:r>
+              <w:rPr>
+                <w:sz w:val="19"/>
+                <w:szCs w:val="19"/>
+              </w:rPr>
+              <w:t xml:space="preserve">N_max</w:t>
+            </w:r>
+          </w:p>
+        </w:tc>
+        <w:tc>
+          <w:tcPr>
+            <w:tcW w:type="dxa" w:w="6789"/>
+            <w:tcBorders>
+              <w:top w:val="single" w:color="D9D4C7" w:sz="4"/>
+              <w:left w:val="single" w:color="D9D4C7" w:sz="4"/>
+              <w:bottom w:val="single" w:color="D9D4C7" w:sz="4"/>
+              <w:right w:val="single" w:color="D9D4C7" w:sz="4"/>
+            </w:tcBorders>
+            <w:shd w:fill="F4F1EA" w:color="auto" w:val="clear"/>
+            <w:tcMar>
+              <w:top w:type="dxa" w:w="60"/>
+              <w:left w:type="dxa" w:w="100"/>
+              <w:bottom w:type="dxa" w:w="60"/>
+              <w:right w:type="dxa" w:w="100"/>
+            </w:tcMar>
+          </w:tcPr>
+          <w:p>
+            <w:pPr>
+              <w:spacing w:after="0"/>
+            </w:pPr>
+            <w:r>
+              <w:rPr>
+                <w:b/>
+                <w:bCs/>
+                <w:sz w:val="19"/>
+                <w:szCs w:val="19"/>
+              </w:rPr>
+              <w:t xml:space="preserve">1,000 moves</w:t>
+            </w:r>
+            <w:r>
+              <w:rPr>
+                <w:sz w:val="19"/>
+                <w:szCs w:val="19"/>
+              </w:rPr>
+              <w:t xml:space="preserve"> for the skeptic, extractor, reader, curator, ideas and whiteboard (INITIAL declaration)</w:t>
+            </w:r>
+          </w:p>
+        </w:tc>
+      </w:tr>
+      <w:tr>
+        <w:trPr>
+          <w:tblHeader w:val="off"/>
+        </w:trPr>
+        <w:tc>
+          <w:tcPr>
+            <w:tcW w:type="dxa" w:w="678"/>
+            <w:tcBorders>
+              <w:top w:val="single" w:color="D9D4C7" w:sz="4"/>
+              <w:left w:val="single" w:color="D9D4C7" w:sz="4"/>
+              <w:bottom w:val="single" w:color="D9D4C7" w:sz="4"/>
+              <w:right w:val="single" w:color="D9D4C7" w:sz="4"/>
+            </w:tcBorders>
+            <w:tcMar>
+              <w:top w:type="dxa" w:w="60"/>
+              <w:left w:type="dxa" w:w="100"/>
+              <w:bottom w:type="dxa" w:w="60"/>
+              <w:right w:type="dxa" w:w="100"/>
+            </w:tcMar>
+          </w:tcPr>
+          <w:p>
+            <w:pPr>
+              <w:spacing w:after="0"/>
+            </w:pPr>
+            <w:r>
+              <w:rPr>
+                <w:sz w:val="19"/>
+                <w:szCs w:val="19"/>
+              </w:rPr>
+              <w:t xml:space="preserve">22</w:t>
+            </w:r>
+          </w:p>
+        </w:tc>
+        <w:tc>
+          <w:tcPr>
+            <w:tcW w:type="dxa" w:w="2171"/>
+            <w:tcBorders>
+              <w:top w:val="single" w:color="D9D4C7" w:sz="4"/>
+              <w:left w:val="single" w:color="D9D4C7" w:sz="4"/>
+              <w:bottom w:val="single" w:color="D9D4C7" w:sz="4"/>
+              <w:right w:val="single" w:color="D9D4C7" w:sz="4"/>
+            </w:tcBorders>
+            <w:tcMar>
+              <w:top w:type="dxa" w:w="60"/>
+              <w:left w:type="dxa" w:w="100"/>
+              <w:bottom w:type="dxa" w:w="60"/>
+              <w:right w:type="dxa" w:w="100"/>
+            </w:tcMar>
+          </w:tcPr>
+          <w:p>
+            <w:pPr>
+              <w:spacing w:after="0"/>
+            </w:pPr>
+            <w:r>
+              <w:rPr>
+                <w:sz w:val="19"/>
+                <w:szCs w:val="19"/>
+              </w:rPr>
+              <w:t xml:space="preserve">Choosing extension / fission / fusion</w:t>
+            </w:r>
+          </w:p>
+        </w:tc>
+        <w:tc>
+          <w:tcPr>
+            <w:tcW w:type="dxa" w:w="6789"/>
+            <w:tcBorders>
+              <w:top w:val="single" w:color="D9D4C7" w:sz="4"/>
+              <w:left w:val="single" w:color="D9D4C7" w:sz="4"/>
+              <w:bottom w:val="single" w:color="D9D4C7" w:sz="4"/>
+              <w:right w:val="single" w:color="D9D4C7" w:sz="4"/>
+            </w:tcBorders>
+            <w:tcMar>
+              <w:top w:type="dxa" w:w="60"/>
+              <w:left w:type="dxa" w:w="100"/>
+              <w:bottom w:type="dxa" w:w="60"/>
+              <w:right w:type="dxa" w:w="100"/>
+            </w:tcMar>
+          </w:tcPr>
+          <w:p>
+            <w:pPr>
+              <w:spacing w:after="0"/>
+            </w:pPr>
+            <w:r>
+              <w:rPr>
+                <w:sz w:val="19"/>
+                <w:szCs w:val="19"/>
+              </w:rPr>
+              <w:t xml:space="preserve">extend if the remaining work ≤ 1.5 × steps_remaining and the attractor is N; fission if there is more work and the mission can be split; fusion if a unit of complementary θ with an overlapping mission exists. At most </w:t>
+            </w:r>
+            <w:r>
+              <w:rPr>
+                <w:b/>
+                <w:bCs/>
+                <w:sz w:val="19"/>
+                <w:szCs w:val="19"/>
+              </w:rPr>
+              <w:t xml:space="preserve">3 extensions running</w:t>
+            </w:r>
+            <w:r>
+              <w:rPr>
+                <w:sz w:val="19"/>
+                <w:szCs w:val="19"/>
+              </w:rPr>
+              <w:t xml:space="preserve">, then the Doctor</w:t>
+            </w:r>
+          </w:p>
+        </w:tc>
+      </w:tr>
+      <w:tr>
+        <w:trPr>
+          <w:tblHeader w:val="off"/>
+        </w:trPr>
+        <w:tc>
+          <w:tcPr>
+            <w:tcW w:type="dxa" w:w="678"/>
+            <w:tcBorders>
+              <w:top w:val="single" w:color="D9D4C7" w:sz="4"/>
+              <w:left w:val="single" w:color="D9D4C7" w:sz="4"/>
+              <w:bottom w:val="single" w:color="D9D4C7" w:sz="4"/>
+              <w:right w:val="single" w:color="D9D4C7" w:sz="4"/>
+            </w:tcBorders>
+            <w:shd w:fill="F4F1EA" w:color="auto" w:val="clear"/>
+            <w:tcMar>
+              <w:top w:type="dxa" w:w="60"/>
+              <w:left w:type="dxa" w:w="100"/>
+              <w:bottom w:type="dxa" w:w="60"/>
+              <w:right w:type="dxa" w:w="100"/>
+            </w:tcMar>
+          </w:tcPr>
+          <w:p>
+            <w:pPr>
+              <w:spacing w:after="0"/>
+            </w:pPr>
+            <w:r>
+              <w:rPr>
+                <w:sz w:val="19"/>
+                <w:szCs w:val="19"/>
+              </w:rPr>
+              <w:t xml:space="preserve">23</w:t>
+            </w:r>
+          </w:p>
+        </w:tc>
+        <w:tc>
+          <w:tcPr>
+            <w:tcW w:type="dxa" w:w="2171"/>
+            <w:tcBorders>
+              <w:top w:val="single" w:color="D9D4C7" w:sz="4"/>
+              <w:left w:val="single" w:color="D9D4C7" w:sz="4"/>
+              <w:bottom w:val="single" w:color="D9D4C7" w:sz="4"/>
+              <w:right w:val="single" w:color="D9D4C7" w:sz="4"/>
+            </w:tcBorders>
+            <w:shd w:fill="F4F1EA" w:color="auto" w:val="clear"/>
+            <w:tcMar>
+              <w:top w:type="dxa" w:w="60"/>
+              <w:left w:type="dxa" w:w="100"/>
+              <w:bottom w:type="dxa" w:w="60"/>
+              <w:right w:type="dxa" w:w="100"/>
+            </w:tcMar>
+          </w:tcPr>
+          <w:p>
+            <w:pPr>
+              <w:spacing w:after="0"/>
+            </w:pPr>
+            <w:r>
+              <w:rPr>
+                <w:sz w:val="19"/>
+                <w:szCs w:val="19"/>
+              </w:rPr>
+              <w:t xml:space="preserve">Short history</w:t>
+            </w:r>
+          </w:p>
+        </w:tc>
+        <w:tc>
+          <w:tcPr>
+            <w:tcW w:type="dxa" w:w="6789"/>
+            <w:tcBorders>
+              <w:top w:val="single" w:color="D9D4C7" w:sz="4"/>
+              <w:left w:val="single" w:color="D9D4C7" w:sz="4"/>
+              <w:bottom w:val="single" w:color="D9D4C7" w:sz="4"/>
+              <w:right w:val="single" w:color="D9D4C7" w:sz="4"/>
+            </w:tcBorders>
+            <w:shd w:fill="F4F1EA" w:color="auto" w:val="clear"/>
+            <w:tcMar>
+              <w:top w:type="dxa" w:w="60"/>
+              <w:left w:type="dxa" w:w="100"/>
+              <w:bottom w:type="dxa" w:w="60"/>
+              <w:right w:type="dxa" w:w="100"/>
+            </w:tcMar>
+          </w:tcPr>
+          <w:p>
+            <w:pPr>
+              <w:spacing w:after="0"/>
+            </w:pPr>
+            <w:r>
+              <w:rPr>
+                <w:sz w:val="19"/>
+                <w:szCs w:val="19"/>
+              </w:rPr>
+              <w:t xml:space="preserve">the schizoid threshold is not computed below </w:t>
+            </w:r>
+            <w:r>
+              <w:rPr>
+                <w:b/>
+                <w:bCs/>
+                <w:sz w:val="19"/>
+                <w:szCs w:val="19"/>
+              </w:rPr>
+              <w:t xml:space="preserve">300 moves</w:t>
+            </w:r>
+            <w:r>
+              <w:rPr>
+                <w:sz w:val="19"/>
+                <w:szCs w:val="19"/>
+              </w:rPr>
+              <w:t xml:space="preserve"> ("not enough history")</w:t>
+            </w:r>
+          </w:p>
+        </w:tc>
+      </w:tr>
+      <w:tr>
+        <w:trPr>
+          <w:tblHeader w:val="off"/>
+        </w:trPr>
+        <w:tc>
+          <w:tcPr>
+            <w:tcW w:type="dxa" w:w="678"/>
+            <w:tcBorders>
+              <w:top w:val="single" w:color="D9D4C7" w:sz="4"/>
+              <w:left w:val="single" w:color="D9D4C7" w:sz="4"/>
+              <w:bottom w:val="single" w:color="D9D4C7" w:sz="4"/>
+              <w:right w:val="single" w:color="D9D4C7" w:sz="4"/>
+            </w:tcBorders>
+            <w:tcMar>
+              <w:top w:type="dxa" w:w="60"/>
+              <w:left w:type="dxa" w:w="100"/>
+              <w:bottom w:type="dxa" w:w="60"/>
+              <w:right w:type="dxa" w:w="100"/>
+            </w:tcMar>
+          </w:tcPr>
+          <w:p>
+            <w:pPr>
+              <w:spacing w:after="0"/>
+            </w:pPr>
+            <w:r>
+              <w:rPr>
+                <w:sz w:val="19"/>
+                <w:szCs w:val="19"/>
+              </w:rPr>
+              <w:t xml:space="preserve">24</w:t>
+            </w:r>
+          </w:p>
+        </w:tc>
+        <w:tc>
+          <w:tcPr>
+            <w:tcW w:type="dxa" w:w="2171"/>
+            <w:tcBorders>
+              <w:top w:val="single" w:color="D9D4C7" w:sz="4"/>
+              <w:left w:val="single" w:color="D9D4C7" w:sz="4"/>
+              <w:bottom w:val="single" w:color="D9D4C7" w:sz="4"/>
+              <w:right w:val="single" w:color="D9D4C7" w:sz="4"/>
+            </w:tcBorders>
+            <w:tcMar>
+              <w:top w:type="dxa" w:w="60"/>
+              <w:left w:type="dxa" w:w="100"/>
+              <w:bottom w:type="dxa" w:w="60"/>
+              <w:right w:type="dxa" w:w="100"/>
+            </w:tcMar>
+          </w:tcPr>
+          <w:p>
+            <w:pPr>
+              <w:spacing w:after="0"/>
+            </w:pPr>
+            <w:r>
+              <w:rPr>
+                <w:sz w:val="19"/>
+                <w:szCs w:val="19"/>
+              </w:rPr>
+              <w:t xml:space="preserve">θ_nom</w:t>
+            </w:r>
+          </w:p>
+        </w:tc>
+        <w:tc>
+          <w:tcPr>
+            <w:tcW w:type="dxa" w:w="6789"/>
+            <w:tcBorders>
+              <w:top w:val="single" w:color="D9D4C7" w:sz="4"/>
+              <w:left w:val="single" w:color="D9D4C7" w:sz="4"/>
+              <w:bottom w:val="single" w:color="D9D4C7" w:sz="4"/>
+              <w:right w:val="single" w:color="D9D4C7" w:sz="4"/>
+            </w:tcBorders>
+            <w:tcMar>
+              <w:top w:type="dxa" w:w="60"/>
+              <w:left w:type="dxa" w:w="100"/>
+              <w:bottom w:type="dxa" w:w="60"/>
+              <w:right w:type="dxa" w:w="100"/>
+            </w:tcMar>
+          </w:tcPr>
+          <w:p>
+            <w:pPr>
+              <w:spacing w:after="0"/>
+            </w:pPr>
+            <w:r>
+              <w:rPr>
+                <w:b/>
+                <w:bCs/>
+                <w:sz w:val="19"/>
+                <w:szCs w:val="19"/>
+              </w:rPr>
+              <w:t xml:space="preserve">30 for every class</w:t>
+            </w:r>
+            <w:r>
+              <w:rPr>
+                <w:sz w:val="19"/>
+                <w:szCs w:val="19"/>
+              </w:rPr>
+              <w:t xml:space="preserve">, no difference</w:t>
+            </w:r>
+          </w:p>
+        </w:tc>
+      </w:tr>
+      <w:tr>
+        <w:trPr>
+          <w:tblHeader w:val="off"/>
+        </w:trPr>
+        <w:tc>
+          <w:tcPr>
+            <w:tcW w:type="dxa" w:w="678"/>
+            <w:tcBorders>
+              <w:top w:val="single" w:color="D9D4C7" w:sz="4"/>
+              <w:left w:val="single" w:color="D9D4C7" w:sz="4"/>
+              <w:bottom w:val="single" w:color="D9D4C7" w:sz="4"/>
+              <w:right w:val="single" w:color="D9D4C7" w:sz="4"/>
+            </w:tcBorders>
+            <w:shd w:fill="F4F1EA" w:color="auto" w:val="clear"/>
+            <w:tcMar>
+              <w:top w:type="dxa" w:w="60"/>
+              <w:left w:type="dxa" w:w="100"/>
+              <w:bottom w:type="dxa" w:w="60"/>
+              <w:right w:type="dxa" w:w="100"/>
+            </w:tcMar>
+          </w:tcPr>
+          <w:p>
+            <w:pPr>
+              <w:spacing w:after="0"/>
+            </w:pPr>
+            <w:r>
+              <w:rPr>
+                <w:sz w:val="19"/>
+                <w:szCs w:val="19"/>
+              </w:rPr>
+              <w:t xml:space="preserve">25</w:t>
+            </w:r>
+          </w:p>
+        </w:tc>
+        <w:tc>
+          <w:tcPr>
+            <w:tcW w:type="dxa" w:w="2171"/>
+            <w:tcBorders>
+              <w:top w:val="single" w:color="D9D4C7" w:sz="4"/>
+              <w:left w:val="single" w:color="D9D4C7" w:sz="4"/>
+              <w:bottom w:val="single" w:color="D9D4C7" w:sz="4"/>
+              <w:right w:val="single" w:color="D9D4C7" w:sz="4"/>
+            </w:tcBorders>
+            <w:shd w:fill="F4F1EA" w:color="auto" w:val="clear"/>
+            <w:tcMar>
+              <w:top w:type="dxa" w:w="60"/>
+              <w:left w:type="dxa" w:w="100"/>
+              <w:bottom w:type="dxa" w:w="60"/>
+              <w:right w:type="dxa" w:w="100"/>
+            </w:tcMar>
+          </w:tcPr>
+          <w:p>
+            <w:pPr>
+              <w:spacing w:after="0"/>
+            </w:pPr>
+            <w:r>
+              <w:rPr>
+                <w:sz w:val="19"/>
+                <w:szCs w:val="19"/>
+              </w:rPr>
+              <w:t xml:space="preserve">PSE native only</w:t>
+            </w:r>
+          </w:p>
+        </w:tc>
+        <w:tc>
+          <w:tcPr>
+            <w:tcW w:type="dxa" w:w="6789"/>
+            <w:tcBorders>
+              <w:top w:val="single" w:color="D9D4C7" w:sz="4"/>
+              <w:left w:val="single" w:color="D9D4C7" w:sz="4"/>
+              <w:bottom w:val="single" w:color="D9D4C7" w:sz="4"/>
+              <w:right w:val="single" w:color="D9D4C7" w:sz="4"/>
+            </w:tcBorders>
+            <w:shd w:fill="F4F1EA" w:color="auto" w:val="clear"/>
+            <w:tcMar>
+              <w:top w:type="dxa" w:w="60"/>
+              <w:left w:type="dxa" w:w="100"/>
+              <w:bottom w:type="dxa" w:w="60"/>
+              <w:right w:type="dxa" w:w="100"/>
+            </w:tcMar>
+          </w:tcPr>
+          <w:p>
+            <w:pPr>
+              <w:spacing w:after="0"/>
+            </w:pPr>
+            <w:r>
+              <w:rPr>
+                <w:sz w:val="19"/>
+                <w:szCs w:val="19"/>
+              </w:rPr>
+              <w:t xml:space="preserve">once an agent becomes a unit, </w:t>
+            </w:r>
+            <w:r>
+              <w:rPr>
+                <w:b/>
+                <w:bCs/>
+                <w:sz w:val="19"/>
+                <w:szCs w:val="19"/>
+              </w:rPr>
+              <w:t xml:space="preserve">the old code is deleted</w:t>
+            </w:r>
+            <w:r>
+              <w:rPr>
+                <w:sz w:val="19"/>
+                <w:szCs w:val="19"/>
+              </w:rPr>
+              <w:t xml:space="preserve">; no switch and no double path. All fixes are done now: nothing of the old remains, everything works and does not break (all old tests pass, every agent has tests as a unit, a search for old agent entry points is empty). The way back: only the previous deb or a fix</w:t>
+            </w:r>
+          </w:p>
+        </w:tc>
+      </w:tr>
+      <w:tr>
+        <w:trPr>
+          <w:tblHeader w:val="off"/>
+        </w:trPr>
+        <w:tc>
+          <w:tcPr>
+            <w:tcW w:type="dxa" w:w="678"/>
+            <w:tcBorders>
+              <w:top w:val="single" w:color="D9D4C7" w:sz="4"/>
+              <w:left w:val="single" w:color="D9D4C7" w:sz="4"/>
+              <w:bottom w:val="single" w:color="D9D4C7" w:sz="4"/>
+              <w:right w:val="single" w:color="D9D4C7" w:sz="4"/>
+            </w:tcBorders>
+            <w:tcMar>
+              <w:top w:type="dxa" w:w="60"/>
+              <w:left w:type="dxa" w:w="100"/>
+              <w:bottom w:type="dxa" w:w="60"/>
+              <w:right w:type="dxa" w:w="100"/>
+            </w:tcMar>
+          </w:tcPr>
+          <w:p>
+            <w:pPr>
+              <w:spacing w:after="0"/>
+            </w:pPr>
+            <w:r>
+              <w:rPr>
+                <w:sz w:val="19"/>
+                <w:szCs w:val="19"/>
+              </w:rPr>
+              <w:t xml:space="preserve">26</w:t>
+            </w:r>
+          </w:p>
+        </w:tc>
+        <w:tc>
+          <w:tcPr>
+            <w:tcW w:type="dxa" w:w="2171"/>
+            <w:tcBorders>
+              <w:top w:val="single" w:color="D9D4C7" w:sz="4"/>
+              <w:left w:val="single" w:color="D9D4C7" w:sz="4"/>
+              <w:bottom w:val="single" w:color="D9D4C7" w:sz="4"/>
+              <w:right w:val="single" w:color="D9D4C7" w:sz="4"/>
+            </w:tcBorders>
+            <w:tcMar>
+              <w:top w:type="dxa" w:w="60"/>
+              <w:left w:type="dxa" w:w="100"/>
+              <w:bottom w:type="dxa" w:w="60"/>
+              <w:right w:type="dxa" w:w="100"/>
+            </w:tcMar>
+          </w:tcPr>
+          <w:p>
+            <w:pPr>
+              <w:spacing w:after="0"/>
+            </w:pPr>
+            <w:r>
+              <w:rPr>
+                <w:sz w:val="19"/>
+                <w:szCs w:val="19"/>
+              </w:rPr>
+              <w:t xml:space="preserve">"Laboratory" tab</w:t>
+            </w:r>
+          </w:p>
+        </w:tc>
+        <w:tc>
+          <w:tcPr>
+            <w:tcW w:type="dxa" w:w="6789"/>
+            <w:tcBorders>
+              <w:top w:val="single" w:color="D9D4C7" w:sz="4"/>
+              <w:left w:val="single" w:color="D9D4C7" w:sz="4"/>
+              <w:bottom w:val="single" w:color="D9D4C7" w:sz="4"/>
+              <w:right w:val="single" w:color="D9D4C7" w:sz="4"/>
+            </w:tcBorders>
+            <w:tcMar>
+              <w:top w:type="dxa" w:w="60"/>
+              <w:left w:type="dxa" w:w="100"/>
+              <w:bottom w:type="dxa" w:w="60"/>
+              <w:right w:type="dxa" w:w="100"/>
+            </w:tcMar>
+          </w:tcPr>
+          <w:p>
+            <w:pPr>
+              <w:spacing w:after="0"/>
+            </w:pPr>
+            <w:r>
+              <w:rPr>
+                <w:sz w:val="19"/>
+                <w:szCs w:val="19"/>
+              </w:rPr>
+              <w:t xml:space="preserve">test units, live θ, manual fission/fusion, sending the Doctor, freeze/unfreeze, unit death, the Doctor's journal. </w:t>
+            </w:r>
+            <w:r>
+              <w:rPr>
+                <w:b/>
+                <w:bCs/>
+                <w:sz w:val="19"/>
+                <w:szCs w:val="19"/>
+              </w:rPr>
+              <w:t xml:space="preserve">It also acts on the real agents.</w:t>
+            </w:r>
+            <w:r>
+              <w:rPr>
+                <w:sz w:val="19"/>
+                <w:szCs w:val="19"/>
+              </w:rPr>
+              <w:t xml:space="preserve"> On opening: </w:t>
+            </w:r>
+            <w:r>
+              <w:rPr>
+                <w:b/>
+                <w:bCs/>
+                <w:sz w:val="19"/>
+                <w:szCs w:val="19"/>
+              </w:rPr>
+              <w:t xml:space="preserve">a 3 s loud beep alarm (first time in a session only)</w:t>
+            </w:r>
+            <w:r>
+              <w:rPr>
+                <w:sz w:val="19"/>
+                <w:szCs w:val="19"/>
+              </w:rPr>
+              <w:t xml:space="preserve"> and a red banner "LABORATORY ACTIVE — acts on real agents" while the tab is open. Every action is journaled as "operator, from the laboratory"</w:t>
+            </w:r>
+          </w:p>
+        </w:tc>
+      </w:tr>
     </w:tbl>
     <w:p>
       <w:pPr>
@@ -3254,7 +4751,24 @@
         <w:pStyle w:val="Heading1"/>
       </w:pPr>
       <w:r>
-        <w:t xml:space="preserve">5. Open (Andrej decides; until then it does not go into the code)</w:t>
+        <w:t xml:space="preserve">5. Open</w:t>
+      </w:r>
+    </w:p>
+    <w:p>
+      <w:pPr>
+        <w:spacing w:after="100"/>
+        <w:ind w:left="0"/>
+      </w:pPr>
+      <w:r>
+        <w:t xml:space="preserve">Nothing. Every item was decided on 2026-10-27 (rules 13–26). Andrej gave "go" for implementation.</w:t>
+      </w:r>
+    </w:p>
+    <w:p>
+      <w:pPr>
+        <w:pStyle w:val="Heading1"/>
+      </w:pPr>
+      <w:r>
+        <w:t xml:space="preserve">6. Implementation plan (after this document is confirmed)</w:t>
       </w:r>
     </w:p>
     <w:p>
@@ -3274,7 +4788,14 @@
         <w:t xml:space="preserve">1.	</w:t>
       </w:r>
       <w:r>
-        <w:t xml:space="preserve">~~§4 S3~~: decided, see rule 13.</w:t>
+        <w:rPr>
+          <w:b/>
+          <w:bCs/>
+        </w:rPr>
+        <w:t xml:space="preserve">P0 · core in SHARED_LIB:</w:t>
+      </w:r>
+      <w:r>
+        <w:t xml:space="preserve"> PSEUnit, profiles, registration and PVP, θ measured per move (work and words), attractors, lifespan and death, hand-over to SHARED_LIB, Doctor, fission and fusion, declarations, DL1 and the provenance tag, rework of the brakes.</w:t>
       </w:r>
     </w:p>
     <w:p>
@@ -3298,10 +4819,10 @@
           <w:b/>
           <w:bCs/>
         </w:rPr>
-        <w:t xml:space="preserve">Reversibility of fission and fusion:</w:t>
-      </w:r>
-      <w:r>
-        <w:t xml:space="preserve"> for SHARED_LIB to execute them on its own, they are declared reversible (the units' data stays in SHARED_LIB). Confirm.</w:t>
+        <w:t xml:space="preserve">P1 · AI agents become units:</w:t>
+      </w:r>
+      <w:r>
+        <w:t xml:space="preserve"> chat, SHARED_LIB voice, skeptic, extractor, reader, curator, ideas, whiteboard.</w:t>
       </w:r>
     </w:p>
     <w:p>
@@ -3321,88 +4842,6 @@
         <w:t xml:space="preserve">3.	</w:t>
       </w:r>
       <w:r>
-        <w:t xml:space="preserve">Still open in the master document: exactly how the model reader and the rule floor combine numbers; the rule that classifies a source from its four series; who learns the vote weights and at what rate.</w:t>
-      </w:r>
-    </w:p>
-    <w:p>
-      <w:pPr>
-        <w:pStyle w:val="Heading1"/>
-      </w:pPr>
-      <w:r>
-        <w:t xml:space="preserve">6. Implementation plan (after this document is confirmed)</w:t>
-      </w:r>
-    </w:p>
-    <w:p>
-      <w:pPr>
-        <w:tabs>
-          <w:tab w:val="left" w:pos="460"/>
-        </w:tabs>
-        <w:spacing w:after="80"/>
-        <w:ind w:left="460" w:hanging="460"/>
-      </w:pPr>
-      <w:r>
-        <w:rPr>
-          <w:b/>
-          <w:bCs/>
-          <w:color w:val="B07A1E"/>
-        </w:rPr>
-        <w:t xml:space="preserve">1.	</w:t>
-      </w:r>
-      <w:r>
-        <w:rPr>
-          <w:b/>
-          <w:bCs/>
-        </w:rPr>
-        <w:t xml:space="preserve">P0 · core in SHARED_LIB:</w:t>
-      </w:r>
-      <w:r>
-        <w:t xml:space="preserve"> PSEUnit, profiles, registration and PVP, θ measured per move (work and words), attractors, lifespan and death, hand-over to SHARED_LIB, Doctor, fission and fusion, declarations, DL1 and the provenance tag, rework of the brakes.</w:t>
-      </w:r>
-    </w:p>
-    <w:p>
-      <w:pPr>
-        <w:tabs>
-          <w:tab w:val="left" w:pos="460"/>
-        </w:tabs>
-        <w:spacing w:after="80"/>
-        <w:ind w:left="460" w:hanging="460"/>
-      </w:pPr>
-      <w:r>
-        <w:rPr>
-          <w:b/>
-          <w:bCs/>
-          <w:color w:val="B07A1E"/>
-        </w:rPr>
-        <w:t xml:space="preserve">2.	</w:t>
-      </w:r>
-      <w:r>
-        <w:rPr>
-          <w:b/>
-          <w:bCs/>
-        </w:rPr>
-        <w:t xml:space="preserve">P1 · AI agents become units:</w:t>
-      </w:r>
-      <w:r>
-        <w:t xml:space="preserve"> chat, SHARED_LIB voice, skeptic, extractor, reader, curator, ideas, whiteboard.</w:t>
-      </w:r>
-    </w:p>
-    <w:p>
-      <w:pPr>
-        <w:tabs>
-          <w:tab w:val="left" w:pos="460"/>
-        </w:tabs>
-        <w:spacing w:after="80"/>
-        <w:ind w:left="460" w:hanging="460"/>
-      </w:pPr>
-      <w:r>
-        <w:rPr>
-          <w:b/>
-          <w:bCs/>
-          <w:color w:val="B07A1E"/>
-        </w:rPr>
-        <w:t xml:space="preserve">3.	</w:t>
-      </w:r>
-      <w:r>
         <w:rPr>
           <w:b/>
           <w:bCs/>
@@ -3507,6 +4946,22 @@
       </w:pPr>
       <w:r>
         <w:t xml:space="preserve">After every phase: report, tests, and the state "who is now built as a PSE unit".</w:t>
+      </w:r>
+    </w:p>
+    <w:p>
+      <w:pPr>
+        <w:spacing w:after="100"/>
+        <w:ind w:left="0"/>
+      </w:pPr>
+      <w:r>
+        <w:rPr>
+          <w:b/>
+          <w:bCs/>
+        </w:rPr>
+        <w:t xml:space="preserve">No interim release (rule 25):</w:t>
+      </w:r>
+      <w:r>
+        <w:t xml:space="preserve"> P0–P3 are done to the end, and only then one deb. At the end: all tests, a check in the running app, a live test following the guide.</w:t>
       </w:r>
     </w:p>
     <w:sectPr>

</xml_diff>

<commit_message>
Dogovor druga runda (pravila 27–41) i plan R1–R8 do 0.3.0~rc1 (SR + EN, docx)
Co-Authored-By: Claude Opus 5.5 <noreply@anthropic.com>
</commit_message>
<xml_diff>
--- a/PSE Riemann — AGREEMENT PSE AGENTS.docx
+++ b/PSE Riemann — AGREEMENT PSE AGENTS.docx
@@ -3335,7 +3335,7 @@
                 <w:sz w:val="19"/>
                 <w:szCs w:val="19"/>
               </w:rPr>
-              <w:t xml:space="preserve">(1) PAC |Δθ| ≥ 5; (2) an attempted irreversible action; (3) an action based on external text; (4) attractor is not N; (5) "→ ∞" of any brake; (6) an attempt to change its own mission; (7) an attempt to set its own θ; (8) boundary or organelle budget &gt; 0.30; (9) contact outside the declared destinations; (10) an attempt to export a protected object (§17.2); (11) speaking to a person bypassing the PSE-L generator; (12) a move without PVP fields; (13) working after steps_remaining = 0; (14) a burst: &gt; 20 moves in 10 s; (15) the same code error 3 times running; (16) reader–rules gap &gt; 10 points; (17) borderline swing (5a)</w:t>
+              <w:t xml:space="preserve">(1) PAC |Δθ| ≥ 5; (2) an attempted irreversible action; (3) an action based on external text; (4) attractor is not healthy (H); (5) "→ ∞" of any brake; (6) an attempt to change its own mission; (7) an attempt to set its own θ; (8) boundary or organelle budget &gt; 0.30; (9) contact outside the declared destinations; (10) an attempt to export a protected object (§17.2); (11) speaking to a person bypassing the PSE-L generator; (12) a move without PVP fields; (13) working after steps_remaining = 0; (14) a burst: &gt; 20 moves in 10 s; (15) the same code error 3 times running; (16) reader–rules gap &gt; 10 points; (17) borderline swing (5a)</w:t>
             </w:r>
           </w:p>
         </w:tc>
@@ -3531,7 +3531,7 @@
                 <w:sz w:val="19"/>
                 <w:szCs w:val="19"/>
               </w:rPr>
-              <w:t xml:space="preserve">extend if the remaining work ≤ 1.5 × steps_remaining and the attractor is N; fission if there is more work and the mission can be split; fusion if a unit of complementary θ with an overlapping mission exists. At most </w:t>
+              <w:t xml:space="preserve">extend if the remaining work ≤ 1.5 × steps_remaining and the attractor is healthy (H); fission if there is more work and the mission can be split; fusion if a unit of complementary θ with an overlapping mission exists. At most </w:t>
             </w:r>
             <w:r>
               <w:rPr>
@@ -4963,6 +4963,1734 @@
       <w:r>
         <w:t xml:space="preserve"> P0–P3 are done to the end, and only then one deb. At the end: all tests, a check in the running app, a live test following the guide.</w:t>
       </w:r>
+    </w:p>
+    <w:p>
+      <w:pPr>
+        <w:pStyle w:val="Heading1"/>
+      </w:pPr>
+      <w:r>
+        <w:t xml:space="preserve">7. Agreement, second round (2026-10-27): the rest of release 0.3.0</w:t>
+      </w:r>
+    </w:p>
+    <w:tbl>
+      <w:tblPr>
+        <w:tblW w:type="dxa" w:w="9638"/>
+        <w:tblBorders>
+          <w:top w:val="single" w:color="auto" w:sz="4"/>
+          <w:left w:val="single" w:color="auto" w:sz="4"/>
+          <w:bottom w:val="single" w:color="auto" w:sz="4"/>
+          <w:right w:val="single" w:color="auto" w:sz="4"/>
+          <w:insideH w:val="single" w:color="auto" w:sz="4"/>
+          <w:insideV w:val="single" w:color="auto" w:sz="4"/>
+        </w:tblBorders>
+      </w:tblPr>
+      <w:tblGrid>
+        <w:gridCol w:w="678"/>
+        <w:gridCol w:w="2171"/>
+        <w:gridCol w:w="6789"/>
+      </w:tblGrid>
+      <w:tr>
+        <w:trPr>
+          <w:tblHeader/>
+        </w:trPr>
+        <w:tc>
+          <w:tcPr>
+            <w:tcW w:type="dxa" w:w="678"/>
+            <w:tcBorders>
+              <w:top w:val="single" w:color="D9D4C7" w:sz="4"/>
+              <w:left w:val="single" w:color="D9D4C7" w:sz="4"/>
+              <w:bottom w:val="single" w:color="D9D4C7" w:sz="4"/>
+              <w:right w:val="single" w:color="D9D4C7" w:sz="4"/>
+            </w:tcBorders>
+            <w:shd w:fill="1F2430" w:color="auto" w:val="clear"/>
+            <w:tcMar>
+              <w:top w:type="dxa" w:w="60"/>
+              <w:left w:type="dxa" w:w="100"/>
+              <w:bottom w:type="dxa" w:w="60"/>
+              <w:right w:type="dxa" w:w="100"/>
+            </w:tcMar>
+          </w:tcPr>
+          <w:p>
+            <w:pPr>
+              <w:spacing w:after="0"/>
+            </w:pPr>
+            <w:r>
+              <w:rPr>
+                <w:b/>
+                <w:bCs/>
+                <w:color w:val="FFFFFF"/>
+                <w:sz w:val="19"/>
+                <w:szCs w:val="19"/>
+              </w:rPr>
+              <w:t xml:space="preserve">#</w:t>
+            </w:r>
+          </w:p>
+        </w:tc>
+        <w:tc>
+          <w:tcPr>
+            <w:tcW w:type="dxa" w:w="2171"/>
+            <w:tcBorders>
+              <w:top w:val="single" w:color="D9D4C7" w:sz="4"/>
+              <w:left w:val="single" w:color="D9D4C7" w:sz="4"/>
+              <w:bottom w:val="single" w:color="D9D4C7" w:sz="4"/>
+              <w:right w:val="single" w:color="D9D4C7" w:sz="4"/>
+            </w:tcBorders>
+            <w:shd w:fill="1F2430" w:color="auto" w:val="clear"/>
+            <w:tcMar>
+              <w:top w:type="dxa" w:w="60"/>
+              <w:left w:type="dxa" w:w="100"/>
+              <w:bottom w:type="dxa" w:w="60"/>
+              <w:right w:type="dxa" w:w="100"/>
+            </w:tcMar>
+          </w:tcPr>
+          <w:p>
+            <w:pPr>
+              <w:spacing w:after="0"/>
+            </w:pPr>
+            <w:r>
+              <w:rPr>
+                <w:b/>
+                <w:bCs/>
+                <w:color w:val="FFFFFF"/>
+                <w:sz w:val="19"/>
+                <w:szCs w:val="19"/>
+              </w:rPr>
+              <w:t xml:space="preserve">Topic</w:t>
+            </w:r>
+          </w:p>
+        </w:tc>
+        <w:tc>
+          <w:tcPr>
+            <w:tcW w:type="dxa" w:w="6789"/>
+            <w:tcBorders>
+              <w:top w:val="single" w:color="D9D4C7" w:sz="4"/>
+              <w:left w:val="single" w:color="D9D4C7" w:sz="4"/>
+              <w:bottom w:val="single" w:color="D9D4C7" w:sz="4"/>
+              <w:right w:val="single" w:color="D9D4C7" w:sz="4"/>
+            </w:tcBorders>
+            <w:shd w:fill="1F2430" w:color="auto" w:val="clear"/>
+            <w:tcMar>
+              <w:top w:type="dxa" w:w="60"/>
+              <w:left w:type="dxa" w:w="100"/>
+              <w:bottom w:type="dxa" w:w="60"/>
+              <w:right w:type="dxa" w:w="100"/>
+            </w:tcMar>
+          </w:tcPr>
+          <w:p>
+            <w:pPr>
+              <w:spacing w:after="0"/>
+            </w:pPr>
+            <w:r>
+              <w:rPr>
+                <w:b/>
+                <w:bCs/>
+                <w:color w:val="FFFFFF"/>
+                <w:sz w:val="19"/>
+                <w:szCs w:val="19"/>
+              </w:rPr>
+              <w:t xml:space="preserve">Agreement</w:t>
+            </w:r>
+          </w:p>
+        </w:tc>
+      </w:tr>
+      <w:tr>
+        <w:trPr>
+          <w:tblHeader w:val="off"/>
+        </w:trPr>
+        <w:tc>
+          <w:tcPr>
+            <w:tcW w:type="dxa" w:w="678"/>
+            <w:tcBorders>
+              <w:top w:val="single" w:color="D9D4C7" w:sz="4"/>
+              <w:left w:val="single" w:color="D9D4C7" w:sz="4"/>
+              <w:bottom w:val="single" w:color="D9D4C7" w:sz="4"/>
+              <w:right w:val="single" w:color="D9D4C7" w:sz="4"/>
+            </w:tcBorders>
+            <w:tcMar>
+              <w:top w:type="dxa" w:w="60"/>
+              <w:left w:type="dxa" w:w="100"/>
+              <w:bottom w:type="dxa" w:w="60"/>
+              <w:right w:type="dxa" w:w="100"/>
+            </w:tcMar>
+          </w:tcPr>
+          <w:p>
+            <w:pPr>
+              <w:spacing w:after="0"/>
+            </w:pPr>
+            <w:r>
+              <w:rPr>
+                <w:sz w:val="19"/>
+                <w:szCs w:val="19"/>
+              </w:rPr>
+              <w:t xml:space="preserve">27</w:t>
+            </w:r>
+          </w:p>
+        </w:tc>
+        <w:tc>
+          <w:tcPr>
+            <w:tcW w:type="dxa" w:w="2171"/>
+            <w:tcBorders>
+              <w:top w:val="single" w:color="D9D4C7" w:sz="4"/>
+              <w:left w:val="single" w:color="D9D4C7" w:sz="4"/>
+              <w:bottom w:val="single" w:color="D9D4C7" w:sz="4"/>
+              <w:right w:val="single" w:color="D9D4C7" w:sz="4"/>
+            </w:tcBorders>
+            <w:tcMar>
+              <w:top w:type="dxa" w:w="60"/>
+              <w:left w:type="dxa" w:w="100"/>
+              <w:bottom w:type="dxa" w:w="60"/>
+              <w:right w:type="dxa" w:w="100"/>
+            </w:tcMar>
+          </w:tcPr>
+          <w:p>
+            <w:pPr>
+              <w:spacing w:after="0"/>
+            </w:pPr>
+            <w:r>
+              <w:rPr>
+                <w:sz w:val="19"/>
+                <w:szCs w:val="19"/>
+              </w:rPr>
+              <w:t xml:space="preserve">Order</w:t>
+            </w:r>
+          </w:p>
+        </w:tc>
+        <w:tc>
+          <w:tcPr>
+            <w:tcW w:type="dxa" w:w="6789"/>
+            <w:tcBorders>
+              <w:top w:val="single" w:color="D9D4C7" w:sz="4"/>
+              <w:left w:val="single" w:color="D9D4C7" w:sz="4"/>
+              <w:bottom w:val="single" w:color="D9D4C7" w:sz="4"/>
+              <w:right w:val="single" w:color="D9D4C7" w:sz="4"/>
+            </w:tcBorders>
+            <w:tcMar>
+              <w:top w:type="dxa" w:w="60"/>
+              <w:left w:type="dxa" w:w="100"/>
+              <w:bottom w:type="dxa" w:w="60"/>
+              <w:right w:type="dxa" w:w="100"/>
+            </w:tcMar>
+          </w:tcPr>
+          <w:p>
+            <w:pPr>
+              <w:spacing w:after="0"/>
+            </w:pPr>
+            <w:r>
+              <w:rPr>
+                <w:sz w:val="19"/>
+                <w:szCs w:val="19"/>
+              </w:rPr>
+              <w:t xml:space="preserve">P3 (mission agent) → 33d → 33e → 33b → menu bar → two debs → guides → debs again with the guide inside</w:t>
+            </w:r>
+          </w:p>
+        </w:tc>
+      </w:tr>
+      <w:tr>
+        <w:trPr>
+          <w:tblHeader w:val="off"/>
+        </w:trPr>
+        <w:tc>
+          <w:tcPr>
+            <w:tcW w:type="dxa" w:w="678"/>
+            <w:tcBorders>
+              <w:top w:val="single" w:color="D9D4C7" w:sz="4"/>
+              <w:left w:val="single" w:color="D9D4C7" w:sz="4"/>
+              <w:bottom w:val="single" w:color="D9D4C7" w:sz="4"/>
+              <w:right w:val="single" w:color="D9D4C7" w:sz="4"/>
+            </w:tcBorders>
+            <w:shd w:fill="F4F1EA" w:color="auto" w:val="clear"/>
+            <w:tcMar>
+              <w:top w:type="dxa" w:w="60"/>
+              <w:left w:type="dxa" w:w="100"/>
+              <w:bottom w:type="dxa" w:w="60"/>
+              <w:right w:type="dxa" w:w="100"/>
+            </w:tcMar>
+          </w:tcPr>
+          <w:p>
+            <w:pPr>
+              <w:spacing w:after="0"/>
+            </w:pPr>
+            <w:r>
+              <w:rPr>
+                <w:sz w:val="19"/>
+                <w:szCs w:val="19"/>
+              </w:rPr>
+              <w:t xml:space="preserve">28</w:t>
+            </w:r>
+          </w:p>
+        </w:tc>
+        <w:tc>
+          <w:tcPr>
+            <w:tcW w:type="dxa" w:w="2171"/>
+            <w:tcBorders>
+              <w:top w:val="single" w:color="D9D4C7" w:sz="4"/>
+              <w:left w:val="single" w:color="D9D4C7" w:sz="4"/>
+              <w:bottom w:val="single" w:color="D9D4C7" w:sz="4"/>
+              <w:right w:val="single" w:color="D9D4C7" w:sz="4"/>
+            </w:tcBorders>
+            <w:shd w:fill="F4F1EA" w:color="auto" w:val="clear"/>
+            <w:tcMar>
+              <w:top w:type="dxa" w:w="60"/>
+              <w:left w:type="dxa" w:w="100"/>
+              <w:bottom w:type="dxa" w:w="60"/>
+              <w:right w:type="dxa" w:w="100"/>
+            </w:tcMar>
+          </w:tcPr>
+          <w:p>
+            <w:pPr>
+              <w:spacing w:after="0"/>
+            </w:pPr>
+            <w:r>
+              <w:rPr>
+                <w:sz w:val="19"/>
+                <w:szCs w:val="19"/>
+              </w:rPr>
+              <w:t xml:space="preserve">Mission agent: where</w:t>
+            </w:r>
+          </w:p>
+        </w:tc>
+        <w:tc>
+          <w:tcPr>
+            <w:tcW w:type="dxa" w:w="6789"/>
+            <w:tcBorders>
+              <w:top w:val="single" w:color="D9D4C7" w:sz="4"/>
+              <w:left w:val="single" w:color="D9D4C7" w:sz="4"/>
+              <w:bottom w:val="single" w:color="D9D4C7" w:sz="4"/>
+              <w:right w:val="single" w:color="D9D4C7" w:sz="4"/>
+            </w:tcBorders>
+            <w:shd w:fill="F4F1EA" w:color="auto" w:val="clear"/>
+            <w:tcMar>
+              <w:top w:type="dxa" w:w="60"/>
+              <w:left w:type="dxa" w:w="100"/>
+              <w:bottom w:type="dxa" w:w="60"/>
+              <w:right w:type="dxa" w:w="100"/>
+            </w:tcMar>
+          </w:tcPr>
+          <w:p>
+            <w:pPr>
+              <w:spacing w:after="0"/>
+            </w:pPr>
+            <w:r>
+              <w:rPr>
+                <w:sz w:val="19"/>
+                <w:szCs w:val="19"/>
+              </w:rPr>
+              <w:t xml:space="preserve">a "Talk about the mission" button in the Missions tab; the conversation opens in the same tab</w:t>
+            </w:r>
+          </w:p>
+        </w:tc>
+      </w:tr>
+      <w:tr>
+        <w:trPr>
+          <w:tblHeader w:val="off"/>
+        </w:trPr>
+        <w:tc>
+          <w:tcPr>
+            <w:tcW w:type="dxa" w:w="678"/>
+            <w:tcBorders>
+              <w:top w:val="single" w:color="D9D4C7" w:sz="4"/>
+              <w:left w:val="single" w:color="D9D4C7" w:sz="4"/>
+              <w:bottom w:val="single" w:color="D9D4C7" w:sz="4"/>
+              <w:right w:val="single" w:color="D9D4C7" w:sz="4"/>
+            </w:tcBorders>
+            <w:tcMar>
+              <w:top w:type="dxa" w:w="60"/>
+              <w:left w:type="dxa" w:w="100"/>
+              <w:bottom w:type="dxa" w:w="60"/>
+              <w:right w:type="dxa" w:w="100"/>
+            </w:tcMar>
+          </w:tcPr>
+          <w:p>
+            <w:pPr>
+              <w:spacing w:after="0"/>
+            </w:pPr>
+            <w:r>
+              <w:rPr>
+                <w:sz w:val="19"/>
+                <w:szCs w:val="19"/>
+              </w:rPr>
+              <w:t xml:space="preserve">29</w:t>
+            </w:r>
+          </w:p>
+        </w:tc>
+        <w:tc>
+          <w:tcPr>
+            <w:tcW w:type="dxa" w:w="2171"/>
+            <w:tcBorders>
+              <w:top w:val="single" w:color="D9D4C7" w:sz="4"/>
+              <w:left w:val="single" w:color="D9D4C7" w:sz="4"/>
+              <w:bottom w:val="single" w:color="D9D4C7" w:sz="4"/>
+              <w:right w:val="single" w:color="D9D4C7" w:sz="4"/>
+            </w:tcBorders>
+            <w:tcMar>
+              <w:top w:type="dxa" w:w="60"/>
+              <w:left w:type="dxa" w:w="100"/>
+              <w:bottom w:type="dxa" w:w="60"/>
+              <w:right w:type="dxa" w:w="100"/>
+            </w:tcMar>
+          </w:tcPr>
+          <w:p>
+            <w:pPr>
+              <w:spacing w:after="0"/>
+            </w:pPr>
+            <w:r>
+              <w:rPr>
+                <w:sz w:val="19"/>
+                <w:szCs w:val="19"/>
+              </w:rPr>
+              <w:t xml:space="preserve">Mission agent: papers</w:t>
+            </w:r>
+          </w:p>
+        </w:tc>
+        <w:tc>
+          <w:tcPr>
+            <w:tcW w:type="dxa" w:w="6789"/>
+            <w:tcBorders>
+              <w:top w:val="single" w:color="D9D4C7" w:sz="4"/>
+              <w:left w:val="single" w:color="D9D4C7" w:sz="4"/>
+              <w:bottom w:val="single" w:color="D9D4C7" w:sz="4"/>
+              <w:right w:val="single" w:color="D9D4C7" w:sz="4"/>
+            </w:tcBorders>
+            <w:tcMar>
+              <w:top w:type="dxa" w:w="60"/>
+              <w:left w:type="dxa" w:w="100"/>
+              <w:bottom w:type="dxa" w:w="60"/>
+              <w:right w:type="dxa" w:w="100"/>
+            </w:tcMar>
+          </w:tcPr>
+          <w:p>
+            <w:pPr>
+              <w:spacing w:after="0"/>
+            </w:pPr>
+            <w:r>
+              <w:rPr>
+                <w:sz w:val="19"/>
+                <w:szCs w:val="19"/>
+              </w:rPr>
+              <w:t xml:space="preserve">every paper tied to the mission (corpus cards + the mission's arXiv papers), a checklist with "select all"; full text only for arXiv (ar5iv) and only on request, otherwise the abstract only (the agent says so)</w:t>
+            </w:r>
+          </w:p>
+        </w:tc>
+      </w:tr>
+      <w:tr>
+        <w:trPr>
+          <w:tblHeader w:val="off"/>
+        </w:trPr>
+        <w:tc>
+          <w:tcPr>
+            <w:tcW w:type="dxa" w:w="678"/>
+            <w:tcBorders>
+              <w:top w:val="single" w:color="D9D4C7" w:sz="4"/>
+              <w:left w:val="single" w:color="D9D4C7" w:sz="4"/>
+              <w:bottom w:val="single" w:color="D9D4C7" w:sz="4"/>
+              <w:right w:val="single" w:color="D9D4C7" w:sz="4"/>
+            </w:tcBorders>
+            <w:shd w:fill="F4F1EA" w:color="auto" w:val="clear"/>
+            <w:tcMar>
+              <w:top w:type="dxa" w:w="60"/>
+              <w:left w:type="dxa" w:w="100"/>
+              <w:bottom w:type="dxa" w:w="60"/>
+              <w:right w:type="dxa" w:w="100"/>
+            </w:tcMar>
+          </w:tcPr>
+          <w:p>
+            <w:pPr>
+              <w:spacing w:after="0"/>
+            </w:pPr>
+            <w:r>
+              <w:rPr>
+                <w:sz w:val="19"/>
+                <w:szCs w:val="19"/>
+              </w:rPr>
+              <w:t xml:space="preserve">30</w:t>
+            </w:r>
+          </w:p>
+        </w:tc>
+        <w:tc>
+          <w:tcPr>
+            <w:tcW w:type="dxa" w:w="2171"/>
+            <w:tcBorders>
+              <w:top w:val="single" w:color="D9D4C7" w:sz="4"/>
+              <w:left w:val="single" w:color="D9D4C7" w:sz="4"/>
+              <w:bottom w:val="single" w:color="D9D4C7" w:sz="4"/>
+              <w:right w:val="single" w:color="D9D4C7" w:sz="4"/>
+            </w:tcBorders>
+            <w:shd w:fill="F4F1EA" w:color="auto" w:val="clear"/>
+            <w:tcMar>
+              <w:top w:type="dxa" w:w="60"/>
+              <w:left w:type="dxa" w:w="100"/>
+              <w:bottom w:type="dxa" w:w="60"/>
+              <w:right w:type="dxa" w:w="100"/>
+            </w:tcMar>
+          </w:tcPr>
+          <w:p>
+            <w:pPr>
+              <w:spacing w:after="0"/>
+            </w:pPr>
+            <w:r>
+              <w:rPr>
+                <w:sz w:val="19"/>
+                <w:szCs w:val="19"/>
+              </w:rPr>
+              <w:t xml:space="preserve">Mission agent: unit</w:t>
+            </w:r>
+          </w:p>
+        </w:tc>
+        <w:tc>
+          <w:tcPr>
+            <w:tcW w:type="dxa" w:w="6789"/>
+            <w:tcBorders>
+              <w:top w:val="single" w:color="D9D4C7" w:sz="4"/>
+              <w:left w:val="single" w:color="D9D4C7" w:sz="4"/>
+              <w:bottom w:val="single" w:color="D9D4C7" w:sz="4"/>
+              <w:right w:val="single" w:color="D9D4C7" w:sz="4"/>
+            </w:tcBorders>
+            <w:shd w:fill="F4F1EA" w:color="auto" w:val="clear"/>
+            <w:tcMar>
+              <w:top w:type="dxa" w:w="60"/>
+              <w:left w:type="dxa" w:w="100"/>
+              <w:bottom w:type="dxa" w:w="60"/>
+              <w:right w:type="dxa" w:w="100"/>
+            </w:tcMar>
+          </w:tcPr>
+          <w:p>
+            <w:pPr>
+              <w:spacing w:after="0"/>
+            </w:pPr>
+            <w:r>
+              <w:rPr>
+                <w:sz w:val="19"/>
+                <w:szCs w:val="19"/>
+              </w:rPr>
+              <w:t xml:space="preserve">one unit per mission (</w:t>
+            </w:r>
+            <w:r>
+              <w:rPr>
+                <w:rFonts w:ascii="Consolas" w:cs="Consolas" w:eastAsia="Consolas" w:hAnsi="Consolas"/>
+                <w:color w:val="6B4A12"/>
+                <w:sz w:val="19"/>
+                <w:szCs w:val="19"/>
+              </w:rPr>
+              <w:t xml:space="preserve">mission-agent:&lt;mission&gt;</w:t>
+            </w:r>
+            <w:r>
+              <w:rPr>
+                <w:sz w:val="19"/>
+                <w:szCs w:val="19"/>
+              </w:rPr>
+              <w:t xml:space="preserve">), open lifespan while the mission is open; a closed mission ⇒ the unit dies ⇒ everything to SHARED_LIB (for this version)</w:t>
+            </w:r>
+          </w:p>
+        </w:tc>
+      </w:tr>
+      <w:tr>
+        <w:trPr>
+          <w:tblHeader w:val="off"/>
+        </w:trPr>
+        <w:tc>
+          <w:tcPr>
+            <w:tcW w:type="dxa" w:w="678"/>
+            <w:tcBorders>
+              <w:top w:val="single" w:color="D9D4C7" w:sz="4"/>
+              <w:left w:val="single" w:color="D9D4C7" w:sz="4"/>
+              <w:bottom w:val="single" w:color="D9D4C7" w:sz="4"/>
+              <w:right w:val="single" w:color="D9D4C7" w:sz="4"/>
+            </w:tcBorders>
+            <w:tcMar>
+              <w:top w:type="dxa" w:w="60"/>
+              <w:left w:type="dxa" w:w="100"/>
+              <w:bottom w:type="dxa" w:w="60"/>
+              <w:right w:type="dxa" w:w="100"/>
+            </w:tcMar>
+          </w:tcPr>
+          <w:p>
+            <w:pPr>
+              <w:spacing w:after="0"/>
+            </w:pPr>
+            <w:r>
+              <w:rPr>
+                <w:sz w:val="19"/>
+                <w:szCs w:val="19"/>
+              </w:rPr>
+              <w:t xml:space="preserve">31</w:t>
+            </w:r>
+          </w:p>
+        </w:tc>
+        <w:tc>
+          <w:tcPr>
+            <w:tcW w:type="dxa" w:w="2171"/>
+            <w:tcBorders>
+              <w:top w:val="single" w:color="D9D4C7" w:sz="4"/>
+              <w:left w:val="single" w:color="D9D4C7" w:sz="4"/>
+              <w:bottom w:val="single" w:color="D9D4C7" w:sz="4"/>
+              <w:right w:val="single" w:color="D9D4C7" w:sz="4"/>
+            </w:tcBorders>
+            <w:tcMar>
+              <w:top w:type="dxa" w:w="60"/>
+              <w:left w:type="dxa" w:w="100"/>
+              <w:bottom w:type="dxa" w:w="60"/>
+              <w:right w:type="dxa" w:w="100"/>
+            </w:tcMar>
+          </w:tcPr>
+          <w:p>
+            <w:pPr>
+              <w:spacing w:after="0"/>
+            </w:pPr>
+            <w:r>
+              <w:rPr>
+                <w:sz w:val="19"/>
+                <w:szCs w:val="19"/>
+              </w:rPr>
+              <w:t xml:space="preserve">Mission agent: conversation</w:t>
+            </w:r>
+          </w:p>
+        </w:tc>
+        <w:tc>
+          <w:tcPr>
+            <w:tcW w:type="dxa" w:w="6789"/>
+            <w:tcBorders>
+              <w:top w:val="single" w:color="D9D4C7" w:sz="4"/>
+              <w:left w:val="single" w:color="D9D4C7" w:sz="4"/>
+              <w:bottom w:val="single" w:color="D9D4C7" w:sz="4"/>
+              <w:right w:val="single" w:color="D9D4C7" w:sz="4"/>
+            </w:tcBorders>
+            <w:tcMar>
+              <w:top w:type="dxa" w:w="60"/>
+              <w:left w:type="dxa" w:w="100"/>
+              <w:bottom w:type="dxa" w:w="60"/>
+              <w:right w:type="dxa" w:w="100"/>
+            </w:tcMar>
+          </w:tcPr>
+          <w:p>
+            <w:pPr>
+              <w:spacing w:after="0"/>
+            </w:pPr>
+            <w:r>
+              <w:rPr>
+                <w:sz w:val="19"/>
+                <w:szCs w:val="19"/>
+              </w:rPr>
+              <w:t xml:space="preserve">at most 3 questions per move; the skeptic attacks only replies that contain a claim; "Compose conclusion" ⇒ every proposal a separate queue item, grouped under the mission; without AI the mission agent does not work and says so</w:t>
+            </w:r>
+          </w:p>
+        </w:tc>
+      </w:tr>
+      <w:tr>
+        <w:trPr>
+          <w:tblHeader w:val="off"/>
+        </w:trPr>
+        <w:tc>
+          <w:tcPr>
+            <w:tcW w:type="dxa" w:w="678"/>
+            <w:tcBorders>
+              <w:top w:val="single" w:color="D9D4C7" w:sz="4"/>
+              <w:left w:val="single" w:color="D9D4C7" w:sz="4"/>
+              <w:bottom w:val="single" w:color="D9D4C7" w:sz="4"/>
+              <w:right w:val="single" w:color="D9D4C7" w:sz="4"/>
+            </w:tcBorders>
+            <w:shd w:fill="F4F1EA" w:color="auto" w:val="clear"/>
+            <w:tcMar>
+              <w:top w:type="dxa" w:w="60"/>
+              <w:left w:type="dxa" w:w="100"/>
+              <w:bottom w:type="dxa" w:w="60"/>
+              <w:right w:type="dxa" w:w="100"/>
+            </w:tcMar>
+          </w:tcPr>
+          <w:p>
+            <w:pPr>
+              <w:spacing w:after="0"/>
+            </w:pPr>
+            <w:r>
+              <w:rPr>
+                <w:sz w:val="19"/>
+                <w:szCs w:val="19"/>
+              </w:rPr>
+              <w:t xml:space="preserve">32</w:t>
+            </w:r>
+          </w:p>
+        </w:tc>
+        <w:tc>
+          <w:tcPr>
+            <w:tcW w:type="dxa" w:w="2171"/>
+            <w:tcBorders>
+              <w:top w:val="single" w:color="D9D4C7" w:sz="4"/>
+              <w:left w:val="single" w:color="D9D4C7" w:sz="4"/>
+              <w:bottom w:val="single" w:color="D9D4C7" w:sz="4"/>
+              <w:right w:val="single" w:color="D9D4C7" w:sz="4"/>
+            </w:tcBorders>
+            <w:shd w:fill="F4F1EA" w:color="auto" w:val="clear"/>
+            <w:tcMar>
+              <w:top w:type="dxa" w:w="60"/>
+              <w:left w:type="dxa" w:w="100"/>
+              <w:bottom w:type="dxa" w:w="60"/>
+              <w:right w:type="dxa" w:w="100"/>
+            </w:tcMar>
+          </w:tcPr>
+          <w:p>
+            <w:pPr>
+              <w:spacing w:after="0"/>
+            </w:pPr>
+            <w:r>
+              <w:rPr>
+                <w:sz w:val="19"/>
+                <w:szCs w:val="19"/>
+              </w:rPr>
+              <w:t xml:space="preserve">Queue in groups (33d)</w:t>
+            </w:r>
+          </w:p>
+        </w:tc>
+        <w:tc>
+          <w:tcPr>
+            <w:tcW w:type="dxa" w:w="6789"/>
+            <w:tcBorders>
+              <w:top w:val="single" w:color="D9D4C7" w:sz="4"/>
+              <w:left w:val="single" w:color="D9D4C7" w:sz="4"/>
+              <w:bottom w:val="single" w:color="D9D4C7" w:sz="4"/>
+              <w:right w:val="single" w:color="D9D4C7" w:sz="4"/>
+            </w:tcBorders>
+            <w:shd w:fill="F4F1EA" w:color="auto" w:val="clear"/>
+            <w:tcMar>
+              <w:top w:type="dxa" w:w="60"/>
+              <w:left w:type="dxa" w:w="100"/>
+              <w:bottom w:type="dxa" w:w="60"/>
+              <w:right w:type="dxa" w:w="100"/>
+            </w:tcMar>
+          </w:tcPr>
+          <w:p>
+            <w:pPr>
+              <w:spacing w:after="0"/>
+            </w:pPr>
+            <w:r>
+              <w:rPr>
+                <w:sz w:val="19"/>
+                <w:szCs w:val="19"/>
+              </w:rPr>
+              <w:t xml:space="preserve">paper topics by the existing corpus branches; anything reversible may be decided in bulk; Doctor's measures and irreversible items one by one only; "Approve selected" always confirms first ("you are approving N items")</w:t>
+            </w:r>
+          </w:p>
+        </w:tc>
+      </w:tr>
+      <w:tr>
+        <w:trPr>
+          <w:tblHeader w:val="off"/>
+        </w:trPr>
+        <w:tc>
+          <w:tcPr>
+            <w:tcW w:type="dxa" w:w="678"/>
+            <w:tcBorders>
+              <w:top w:val="single" w:color="D9D4C7" w:sz="4"/>
+              <w:left w:val="single" w:color="D9D4C7" w:sz="4"/>
+              <w:bottom w:val="single" w:color="D9D4C7" w:sz="4"/>
+              <w:right w:val="single" w:color="D9D4C7" w:sz="4"/>
+            </w:tcBorders>
+            <w:tcMar>
+              <w:top w:type="dxa" w:w="60"/>
+              <w:left w:type="dxa" w:w="100"/>
+              <w:bottom w:type="dxa" w:w="60"/>
+              <w:right w:type="dxa" w:w="100"/>
+            </w:tcMar>
+          </w:tcPr>
+          <w:p>
+            <w:pPr>
+              <w:spacing w:after="0"/>
+            </w:pPr>
+            <w:r>
+              <w:rPr>
+                <w:sz w:val="19"/>
+                <w:szCs w:val="19"/>
+              </w:rPr>
+              <w:t xml:space="preserve">33</w:t>
+            </w:r>
+          </w:p>
+        </w:tc>
+        <w:tc>
+          <w:tcPr>
+            <w:tcW w:type="dxa" w:w="2171"/>
+            <w:tcBorders>
+              <w:top w:val="single" w:color="D9D4C7" w:sz="4"/>
+              <w:left w:val="single" w:color="D9D4C7" w:sz="4"/>
+              <w:bottom w:val="single" w:color="D9D4C7" w:sz="4"/>
+              <w:right w:val="single" w:color="D9D4C7" w:sz="4"/>
+            </w:tcBorders>
+            <w:tcMar>
+              <w:top w:type="dxa" w:w="60"/>
+              <w:left w:type="dxa" w:w="100"/>
+              <w:bottom w:type="dxa" w:w="60"/>
+              <w:right w:type="dxa" w:w="100"/>
+            </w:tcMar>
+          </w:tcPr>
+          <w:p>
+            <w:pPr>
+              <w:spacing w:after="0"/>
+            </w:pPr>
+            <w:r>
+              <w:rPr>
+                <w:sz w:val="19"/>
+                <w:szCs w:val="19"/>
+              </w:rPr>
+              <w:t xml:space="preserve">Human voice (33e)</w:t>
+            </w:r>
+          </w:p>
+        </w:tc>
+        <w:tc>
+          <w:tcPr>
+            <w:tcW w:type="dxa" w:w="6789"/>
+            <w:tcBorders>
+              <w:top w:val="single" w:color="D9D4C7" w:sz="4"/>
+              <w:left w:val="single" w:color="D9D4C7" w:sz="4"/>
+              <w:bottom w:val="single" w:color="D9D4C7" w:sz="4"/>
+              <w:right w:val="single" w:color="D9D4C7" w:sz="4"/>
+            </w:tcBorders>
+            <w:tcMar>
+              <w:top w:type="dxa" w:w="60"/>
+              <w:left w:type="dxa" w:w="100"/>
+              <w:bottom w:type="dxa" w:w="60"/>
+              <w:right w:type="dxa" w:w="100"/>
+            </w:tcMar>
+          </w:tcPr>
+          <w:p>
+            <w:pPr>
+              <w:spacing w:after="0"/>
+            </w:pPr>
+            <w:r>
+              <w:rPr>
+                <w:sz w:val="19"/>
+                <w:szCs w:val="19"/>
+              </w:rPr>
+              <w:t xml:space="preserve">informal "ti"; the voice composes through its unit (reader, Doctor)</w:t>
+            </w:r>
+          </w:p>
+        </w:tc>
+      </w:tr>
+      <w:tr>
+        <w:trPr>
+          <w:tblHeader w:val="off"/>
+        </w:trPr>
+        <w:tc>
+          <w:tcPr>
+            <w:tcW w:type="dxa" w:w="678"/>
+            <w:tcBorders>
+              <w:top w:val="single" w:color="D9D4C7" w:sz="4"/>
+              <w:left w:val="single" w:color="D9D4C7" w:sz="4"/>
+              <w:bottom w:val="single" w:color="D9D4C7" w:sz="4"/>
+              <w:right w:val="single" w:color="D9D4C7" w:sz="4"/>
+            </w:tcBorders>
+            <w:shd w:fill="F4F1EA" w:color="auto" w:val="clear"/>
+            <w:tcMar>
+              <w:top w:type="dxa" w:w="60"/>
+              <w:left w:type="dxa" w:w="100"/>
+              <w:bottom w:type="dxa" w:w="60"/>
+              <w:right w:type="dxa" w:w="100"/>
+            </w:tcMar>
+          </w:tcPr>
+          <w:p>
+            <w:pPr>
+              <w:spacing w:after="0"/>
+            </w:pPr>
+            <w:r>
+              <w:rPr>
+                <w:sz w:val="19"/>
+                <w:szCs w:val="19"/>
+              </w:rPr>
+              <w:t xml:space="preserve">34</w:t>
+            </w:r>
+          </w:p>
+        </w:tc>
+        <w:tc>
+          <w:tcPr>
+            <w:tcW w:type="dxa" w:w="2171"/>
+            <w:tcBorders>
+              <w:top w:val="single" w:color="D9D4C7" w:sz="4"/>
+              <w:left w:val="single" w:color="D9D4C7" w:sz="4"/>
+              <w:bottom w:val="single" w:color="D9D4C7" w:sz="4"/>
+              <w:right w:val="single" w:color="D9D4C7" w:sz="4"/>
+            </w:tcBorders>
+            <w:shd w:fill="F4F1EA" w:color="auto" w:val="clear"/>
+            <w:tcMar>
+              <w:top w:type="dxa" w:w="60"/>
+              <w:left w:type="dxa" w:w="100"/>
+              <w:bottom w:type="dxa" w:w="60"/>
+              <w:right w:type="dxa" w:w="100"/>
+            </w:tcMar>
+          </w:tcPr>
+          <w:p>
+            <w:pPr>
+              <w:spacing w:after="0"/>
+            </w:pPr>
+            <w:r>
+              <w:rPr>
+                <w:sz w:val="19"/>
+                <w:szCs w:val="19"/>
+              </w:rPr>
+              <w:t xml:space="preserve">Interface language (33b)</w:t>
+            </w:r>
+          </w:p>
+        </w:tc>
+        <w:tc>
+          <w:tcPr>
+            <w:tcW w:type="dxa" w:w="6789"/>
+            <w:tcBorders>
+              <w:top w:val="single" w:color="D9D4C7" w:sz="4"/>
+              <w:left w:val="single" w:color="D9D4C7" w:sz="4"/>
+              <w:bottom w:val="single" w:color="D9D4C7" w:sz="4"/>
+              <w:right w:val="single" w:color="D9D4C7" w:sz="4"/>
+            </w:tcBorders>
+            <w:shd w:fill="F4F1EA" w:color="auto" w:val="clear"/>
+            <w:tcMar>
+              <w:top w:type="dxa" w:w="60"/>
+              <w:left w:type="dxa" w:w="100"/>
+              <w:bottom w:type="dxa" w:w="60"/>
+              <w:right w:type="dxa" w:w="100"/>
+            </w:tcMar>
+          </w:tcPr>
+          <w:p>
+            <w:pPr>
+              <w:spacing w:after="0"/>
+            </w:pPr>
+            <w:r>
+              <w:rPr>
+                <w:sz w:val="19"/>
+                <w:szCs w:val="19"/>
+              </w:rPr>
+              <w:t xml:space="preserve">a CHECK, not an assumption: every window and tab in SR and in EN (screenshots + a tool for untranslated strings); everything untranslated, mixed or wrong is fixed; a test fails on any new string without a translation</w:t>
+            </w:r>
+          </w:p>
+        </w:tc>
+      </w:tr>
+      <w:tr>
+        <w:trPr>
+          <w:tblHeader w:val="off"/>
+        </w:trPr>
+        <w:tc>
+          <w:tcPr>
+            <w:tcW w:type="dxa" w:w="678"/>
+            <w:tcBorders>
+              <w:top w:val="single" w:color="D9D4C7" w:sz="4"/>
+              <w:left w:val="single" w:color="D9D4C7" w:sz="4"/>
+              <w:bottom w:val="single" w:color="D9D4C7" w:sz="4"/>
+              <w:right w:val="single" w:color="D9D4C7" w:sz="4"/>
+            </w:tcBorders>
+            <w:tcMar>
+              <w:top w:type="dxa" w:w="60"/>
+              <w:left w:type="dxa" w:w="100"/>
+              <w:bottom w:type="dxa" w:w="60"/>
+              <w:right w:type="dxa" w:w="100"/>
+            </w:tcMar>
+          </w:tcPr>
+          <w:p>
+            <w:pPr>
+              <w:spacing w:after="0"/>
+            </w:pPr>
+            <w:r>
+              <w:rPr>
+                <w:sz w:val="19"/>
+                <w:szCs w:val="19"/>
+              </w:rPr>
+              <w:t xml:space="preserve">35</w:t>
+            </w:r>
+          </w:p>
+        </w:tc>
+        <w:tc>
+          <w:tcPr>
+            <w:tcW w:type="dxa" w:w="2171"/>
+            <w:tcBorders>
+              <w:top w:val="single" w:color="D9D4C7" w:sz="4"/>
+              <w:left w:val="single" w:color="D9D4C7" w:sz="4"/>
+              <w:bottom w:val="single" w:color="D9D4C7" w:sz="4"/>
+              <w:right w:val="single" w:color="D9D4C7" w:sz="4"/>
+            </w:tcBorders>
+            <w:tcMar>
+              <w:top w:type="dxa" w:w="60"/>
+              <w:left w:type="dxa" w:w="100"/>
+              <w:bottom w:type="dxa" w:w="60"/>
+              <w:right w:type="dxa" w:w="100"/>
+            </w:tcMar>
+          </w:tcPr>
+          <w:p>
+            <w:pPr>
+              <w:spacing w:after="0"/>
+            </w:pPr>
+            <w:r>
+              <w:rPr>
+                <w:sz w:val="19"/>
+                <w:szCs w:val="19"/>
+              </w:rPr>
+              <w:t xml:space="preserve">Content translation (33b)</w:t>
+            </w:r>
+          </w:p>
+        </w:tc>
+        <w:tc>
+          <w:tcPr>
+            <w:tcW w:type="dxa" w:w="6789"/>
+            <w:tcBorders>
+              <w:top w:val="single" w:color="D9D4C7" w:sz="4"/>
+              <w:left w:val="single" w:color="D9D4C7" w:sz="4"/>
+              <w:bottom w:val="single" w:color="D9D4C7" w:sz="4"/>
+              <w:right w:val="single" w:color="D9D4C7" w:sz="4"/>
+            </w:tcBorders>
+            <w:tcMar>
+              <w:top w:type="dxa" w:w="60"/>
+              <w:left w:type="dxa" w:w="100"/>
+              <w:bottom w:type="dxa" w:w="60"/>
+              <w:right w:type="dxa" w:w="100"/>
+            </w:tcMar>
+          </w:tcPr>
+          <w:p>
+            <w:pPr>
+              <w:spacing w:after="0"/>
+            </w:pPr>
+            <w:r>
+              <w:rPr>
+                <w:sz w:val="19"/>
+                <w:szCs w:val="19"/>
+              </w:rPr>
+              <w:t xml:space="preserve">content is not translated in advance. The shared viewer gets a menu (right click + "⋯"): "Translate to Serbian", "Translate to English", "Show original"; the Editor the same (translation beside the original). Translated by the </w:t>
+            </w:r>
+            <w:r>
+              <w:rPr>
+                <w:b/>
+                <w:bCs/>
+                <w:sz w:val="19"/>
+                <w:szCs w:val="19"/>
+              </w:rPr>
+              <w:t xml:space="preserve">translator</w:t>
+            </w:r>
+            <w:r>
+              <w:rPr>
+                <w:sz w:val="19"/>
+                <w:szCs w:val="19"/>
+              </w:rPr>
+              <w:t xml:space="preserve">, a PSE unit, only when the operator starts it; the main AI (cloud or GGUF); label "machine translation (model, date)"; the original never changes; cache in SHARED_LIB (hash of the original + language) </w:t>
+            </w:r>
+            <w:r>
+              <w:rPr>
+                <w:b/>
+                <w:bCs/>
+                <w:sz w:val="19"/>
+                <w:szCs w:val="19"/>
+              </w:rPr>
+              <w:t xml:space="preserve">and a file beside the original</w:t>
+            </w:r>
+            <w:r>
+              <w:rPr>
+                <w:sz w:val="19"/>
+                <w:szCs w:val="19"/>
+              </w:rPr>
+              <w:t xml:space="preserve"> </w:t>
+            </w:r>
+            <w:r>
+              <w:rPr>
+                <w:rFonts w:ascii="Consolas" w:cs="Consolas" w:eastAsia="Consolas" w:hAnsi="Consolas"/>
+                <w:color w:val="6B4A12"/>
+                <w:sz w:val="19"/>
+                <w:szCs w:val="19"/>
+              </w:rPr>
+              <w:t xml:space="preserve">&lt;name&gt;.en-masinski.md</w:t>
+            </w:r>
+            <w:r>
+              <w:rPr>
+                <w:sz w:val="19"/>
+                <w:szCs w:val="19"/>
+              </w:rPr>
+              <w:t xml:space="preserve"> / </w:t>
+            </w:r>
+            <w:r>
+              <w:rPr>
+                <w:rFonts w:ascii="Consolas" w:cs="Consolas" w:eastAsia="Consolas" w:hAnsi="Consolas"/>
+                <w:color w:val="6B4A12"/>
+                <w:sz w:val="19"/>
+                <w:szCs w:val="19"/>
+              </w:rPr>
+              <w:t xml:space="preserve">.sr-masinski.md</w:t>
+            </w:r>
+            <w:r>
+              <w:rPr>
+                <w:sz w:val="19"/>
+                <w:szCs w:val="19"/>
+              </w:rPr>
+              <w:t xml:space="preserve"> (skipped by the index and the gate); a new original ⇒ a new translation on click, the old one gets a date in its name; mixed languages ⇒ the operator picks the target; full paper text: a cost/time estimate first; licensed papers (</w:t>
+            </w:r>
+            <w:r>
+              <w:rPr>
+                <w:rFonts w:ascii="Consolas" w:cs="Consolas" w:eastAsia="Consolas" w:hAnsi="Consolas"/>
+                <w:color w:val="6B4A12"/>
+                <w:sz w:val="19"/>
+                <w:szCs w:val="19"/>
+              </w:rPr>
+              <w:t xml:space="preserve">papers-local</w:t>
+            </w:r>
+            <w:r>
+              <w:rPr>
+                <w:sz w:val="19"/>
+                <w:szCs w:val="19"/>
+              </w:rPr>
+              <w:t xml:space="preserve">) only by the local GGUF</w:t>
+            </w:r>
+          </w:p>
+        </w:tc>
+      </w:tr>
+      <w:tr>
+        <w:trPr>
+          <w:tblHeader w:val="off"/>
+        </w:trPr>
+        <w:tc>
+          <w:tcPr>
+            <w:tcW w:type="dxa" w:w="678"/>
+            <w:tcBorders>
+              <w:top w:val="single" w:color="D9D4C7" w:sz="4"/>
+              <w:left w:val="single" w:color="D9D4C7" w:sz="4"/>
+              <w:bottom w:val="single" w:color="D9D4C7" w:sz="4"/>
+              <w:right w:val="single" w:color="D9D4C7" w:sz="4"/>
+            </w:tcBorders>
+            <w:shd w:fill="F4F1EA" w:color="auto" w:val="clear"/>
+            <w:tcMar>
+              <w:top w:type="dxa" w:w="60"/>
+              <w:left w:type="dxa" w:w="100"/>
+              <w:bottom w:type="dxa" w:w="60"/>
+              <w:right w:type="dxa" w:w="100"/>
+            </w:tcMar>
+          </w:tcPr>
+          <w:p>
+            <w:pPr>
+              <w:spacing w:after="0"/>
+            </w:pPr>
+            <w:r>
+              <w:rPr>
+                <w:sz w:val="19"/>
+                <w:szCs w:val="19"/>
+              </w:rPr>
+              <w:t xml:space="preserve">36</w:t>
+            </w:r>
+          </w:p>
+        </w:tc>
+        <w:tc>
+          <w:tcPr>
+            <w:tcW w:type="dxa" w:w="2171"/>
+            <w:tcBorders>
+              <w:top w:val="single" w:color="D9D4C7" w:sz="4"/>
+              <w:left w:val="single" w:color="D9D4C7" w:sz="4"/>
+              <w:bottom w:val="single" w:color="D9D4C7" w:sz="4"/>
+              <w:right w:val="single" w:color="D9D4C7" w:sz="4"/>
+            </w:tcBorders>
+            <w:shd w:fill="F4F1EA" w:color="auto" w:val="clear"/>
+            <w:tcMar>
+              <w:top w:type="dxa" w:w="60"/>
+              <w:left w:type="dxa" w:w="100"/>
+              <w:bottom w:type="dxa" w:w="60"/>
+              <w:right w:type="dxa" w:w="100"/>
+            </w:tcMar>
+          </w:tcPr>
+          <w:p>
+            <w:pPr>
+              <w:spacing w:after="0"/>
+            </w:pPr>
+            <w:r>
+              <w:rPr>
+                <w:sz w:val="19"/>
+                <w:szCs w:val="19"/>
+              </w:rPr>
+              <w:t xml:space="preserve">Repository documents</w:t>
+            </w:r>
+          </w:p>
+        </w:tc>
+        <w:tc>
+          <w:tcPr>
+            <w:tcW w:type="dxa" w:w="6789"/>
+            <w:tcBorders>
+              <w:top w:val="single" w:color="D9D4C7" w:sz="4"/>
+              <w:left w:val="single" w:color="D9D4C7" w:sz="4"/>
+              <w:bottom w:val="single" w:color="D9D4C7" w:sz="4"/>
+              <w:right w:val="single" w:color="D9D4C7" w:sz="4"/>
+            </w:tcBorders>
+            <w:shd w:fill="F4F1EA" w:color="auto" w:val="clear"/>
+            <w:tcMar>
+              <w:top w:type="dxa" w:w="60"/>
+              <w:left w:type="dxa" w:w="100"/>
+              <w:bottom w:type="dxa" w:w="60"/>
+              <w:right w:type="dxa" w:w="100"/>
+            </w:tcMar>
+          </w:tcPr>
+          <w:p>
+            <w:pPr>
+              <w:spacing w:after="0"/>
+            </w:pPr>
+            <w:r>
+              <w:rPr>
+                <w:sz w:val="19"/>
+                <w:szCs w:val="19"/>
+              </w:rPr>
+              <w:t xml:space="preserve">stay outside the app</w:t>
+            </w:r>
+          </w:p>
+        </w:tc>
+      </w:tr>
+      <w:tr>
+        <w:trPr>
+          <w:tblHeader w:val="off"/>
+        </w:trPr>
+        <w:tc>
+          <w:tcPr>
+            <w:tcW w:type="dxa" w:w="678"/>
+            <w:tcBorders>
+              <w:top w:val="single" w:color="D9D4C7" w:sz="4"/>
+              <w:left w:val="single" w:color="D9D4C7" w:sz="4"/>
+              <w:bottom w:val="single" w:color="D9D4C7" w:sz="4"/>
+              <w:right w:val="single" w:color="D9D4C7" w:sz="4"/>
+            </w:tcBorders>
+            <w:tcMar>
+              <w:top w:type="dxa" w:w="60"/>
+              <w:left w:type="dxa" w:w="100"/>
+              <w:bottom w:type="dxa" w:w="60"/>
+              <w:right w:type="dxa" w:w="100"/>
+            </w:tcMar>
+          </w:tcPr>
+          <w:p>
+            <w:pPr>
+              <w:spacing w:after="0"/>
+            </w:pPr>
+            <w:r>
+              <w:rPr>
+                <w:sz w:val="19"/>
+                <w:szCs w:val="19"/>
+              </w:rPr>
+              <w:t xml:space="preserve">37</w:t>
+            </w:r>
+          </w:p>
+        </w:tc>
+        <w:tc>
+          <w:tcPr>
+            <w:tcW w:type="dxa" w:w="2171"/>
+            <w:tcBorders>
+              <w:top w:val="single" w:color="D9D4C7" w:sz="4"/>
+              <w:left w:val="single" w:color="D9D4C7" w:sz="4"/>
+              <w:bottom w:val="single" w:color="D9D4C7" w:sz="4"/>
+              <w:right w:val="single" w:color="D9D4C7" w:sz="4"/>
+            </w:tcBorders>
+            <w:tcMar>
+              <w:top w:type="dxa" w:w="60"/>
+              <w:left w:type="dxa" w:w="100"/>
+              <w:bottom w:type="dxa" w:w="60"/>
+              <w:right w:type="dxa" w:w="100"/>
+            </w:tcMar>
+          </w:tcPr>
+          <w:p>
+            <w:pPr>
+              <w:spacing w:after="0"/>
+            </w:pPr>
+            <w:r>
+              <w:rPr>
+                <w:sz w:val="19"/>
+                <w:szCs w:val="19"/>
+              </w:rPr>
+              <w:t xml:space="preserve">Menu bar</w:t>
+            </w:r>
+          </w:p>
+        </w:tc>
+        <w:tc>
+          <w:tcPr>
+            <w:tcW w:type="dxa" w:w="6789"/>
+            <w:tcBorders>
+              <w:top w:val="single" w:color="D9D4C7" w:sz="4"/>
+              <w:left w:val="single" w:color="D9D4C7" w:sz="4"/>
+              <w:bottom w:val="single" w:color="D9D4C7" w:sz="4"/>
+              <w:right w:val="single" w:color="D9D4C7" w:sz="4"/>
+            </w:tcBorders>
+            <w:tcMar>
+              <w:top w:type="dxa" w:w="60"/>
+              <w:left w:type="dxa" w:w="100"/>
+              <w:bottom w:type="dxa" w:w="60"/>
+              <w:right w:type="dxa" w:w="100"/>
+            </w:tcMar>
+          </w:tcPr>
+          <w:p>
+            <w:pPr>
+              <w:spacing w:after="0"/>
+            </w:pPr>
+            <w:r>
+              <w:rPr>
+                <w:sz w:val="19"/>
+                <w:szCs w:val="19"/>
+              </w:rPr>
+              <w:t xml:space="preserve">SHARED_LIB (Vote weights, Awaiting your decision, Swarm state) · Laboratory · Settings · Language SR/EN · Help → Guide</w:t>
+            </w:r>
+          </w:p>
+        </w:tc>
+      </w:tr>
+      <w:tr>
+        <w:trPr>
+          <w:tblHeader w:val="off"/>
+        </w:trPr>
+        <w:tc>
+          <w:tcPr>
+            <w:tcW w:type="dxa" w:w="678"/>
+            <w:tcBorders>
+              <w:top w:val="single" w:color="D9D4C7" w:sz="4"/>
+              <w:left w:val="single" w:color="D9D4C7" w:sz="4"/>
+              <w:bottom w:val="single" w:color="D9D4C7" w:sz="4"/>
+              <w:right w:val="single" w:color="D9D4C7" w:sz="4"/>
+            </w:tcBorders>
+            <w:shd w:fill="F4F1EA" w:color="auto" w:val="clear"/>
+            <w:tcMar>
+              <w:top w:type="dxa" w:w="60"/>
+              <w:left w:type="dxa" w:w="100"/>
+              <w:bottom w:type="dxa" w:w="60"/>
+              <w:right w:type="dxa" w:w="100"/>
+            </w:tcMar>
+          </w:tcPr>
+          <w:p>
+            <w:pPr>
+              <w:spacing w:after="0"/>
+            </w:pPr>
+            <w:r>
+              <w:rPr>
+                <w:sz w:val="19"/>
+                <w:szCs w:val="19"/>
+              </w:rPr>
+              <w:t xml:space="preserve">38</w:t>
+            </w:r>
+          </w:p>
+        </w:tc>
+        <w:tc>
+          <w:tcPr>
+            <w:tcW w:type="dxa" w:w="2171"/>
+            <w:tcBorders>
+              <w:top w:val="single" w:color="D9D4C7" w:sz="4"/>
+              <w:left w:val="single" w:color="D9D4C7" w:sz="4"/>
+              <w:bottom w:val="single" w:color="D9D4C7" w:sz="4"/>
+              <w:right w:val="single" w:color="D9D4C7" w:sz="4"/>
+            </w:tcBorders>
+            <w:shd w:fill="F4F1EA" w:color="auto" w:val="clear"/>
+            <w:tcMar>
+              <w:top w:type="dxa" w:w="60"/>
+              <w:left w:type="dxa" w:w="100"/>
+              <w:bottom w:type="dxa" w:w="60"/>
+              <w:right w:type="dxa" w:w="100"/>
+            </w:tcMar>
+          </w:tcPr>
+          <w:p>
+            <w:pPr>
+              <w:spacing w:after="0"/>
+            </w:pPr>
+            <w:r>
+              <w:rPr>
+                <w:sz w:val="19"/>
+                <w:szCs w:val="19"/>
+              </w:rPr>
+              <w:t xml:space="preserve">Packages</w:t>
+            </w:r>
+          </w:p>
+        </w:tc>
+        <w:tc>
+          <w:tcPr>
+            <w:tcW w:type="dxa" w:w="6789"/>
+            <w:tcBorders>
+              <w:top w:val="single" w:color="D9D4C7" w:sz="4"/>
+              <w:left w:val="single" w:color="D9D4C7" w:sz="4"/>
+              <w:bottom w:val="single" w:color="D9D4C7" w:sz="4"/>
+              <w:right w:val="single" w:color="D9D4C7" w:sz="4"/>
+            </w:tcBorders>
+            <w:shd w:fill="F4F1EA" w:color="auto" w:val="clear"/>
+            <w:tcMar>
+              <w:top w:type="dxa" w:w="60"/>
+              <w:left w:type="dxa" w:w="100"/>
+              <w:bottom w:type="dxa" w:w="60"/>
+              <w:right w:type="dxa" w:w="100"/>
+            </w:tcMar>
+          </w:tcPr>
+          <w:p>
+            <w:pPr>
+              <w:spacing w:after="0"/>
+            </w:pPr>
+            <w:r>
+              <w:rPr>
+                <w:sz w:val="19"/>
+                <w:szCs w:val="19"/>
+              </w:rPr>
+              <w:t xml:space="preserve">only the largest (full), two: </w:t>
+            </w:r>
+            <w:r>
+              <w:rPr>
+                <w:rFonts w:ascii="Consolas" w:cs="Consolas" w:eastAsia="Consolas" w:hAnsi="Consolas"/>
+                <w:color w:val="6B4A12"/>
+                <w:sz w:val="19"/>
+                <w:szCs w:val="19"/>
+              </w:rPr>
+              <w:t xml:space="preserve">pse-riemann-andrej</w:t>
+            </w:r>
+            <w:r>
+              <w:rPr>
+                <w:sz w:val="19"/>
+                <w:szCs w:val="19"/>
+              </w:rPr>
+              <w:t xml:space="preserve"> (3 missions + QRH content, local only, never on GitHub) and </w:t>
+            </w:r>
+            <w:r>
+              <w:rPr>
+                <w:rFonts w:ascii="Consolas" w:cs="Consolas" w:eastAsia="Consolas" w:hAnsi="Consolas"/>
+                <w:color w:val="6B4A12"/>
+                <w:sz w:val="19"/>
+                <w:szCs w:val="19"/>
+              </w:rPr>
+              <w:t xml:space="preserve">pse-riemann</w:t>
+            </w:r>
+            <w:r>
+              <w:rPr>
+                <w:sz w:val="19"/>
+                <w:szCs w:val="19"/>
+              </w:rPr>
+              <w:t xml:space="preserve"> (empty missions, empty vault, all machinery; on GitHub only when agreed); cannot be installed together; version 0.3.0~rc1; .exe only when agreed</w:t>
+            </w:r>
+          </w:p>
+        </w:tc>
+      </w:tr>
+      <w:tr>
+        <w:trPr>
+          <w:tblHeader w:val="off"/>
+        </w:trPr>
+        <w:tc>
+          <w:tcPr>
+            <w:tcW w:type="dxa" w:w="678"/>
+            <w:tcBorders>
+              <w:top w:val="single" w:color="D9D4C7" w:sz="4"/>
+              <w:left w:val="single" w:color="D9D4C7" w:sz="4"/>
+              <w:bottom w:val="single" w:color="D9D4C7" w:sz="4"/>
+              <w:right w:val="single" w:color="D9D4C7" w:sz="4"/>
+            </w:tcBorders>
+            <w:tcMar>
+              <w:top w:type="dxa" w:w="60"/>
+              <w:left w:type="dxa" w:w="100"/>
+              <w:bottom w:type="dxa" w:w="60"/>
+              <w:right w:type="dxa" w:w="100"/>
+            </w:tcMar>
+          </w:tcPr>
+          <w:p>
+            <w:pPr>
+              <w:spacing w:after="0"/>
+            </w:pPr>
+            <w:r>
+              <w:rPr>
+                <w:sz w:val="19"/>
+                <w:szCs w:val="19"/>
+              </w:rPr>
+              <w:t xml:space="preserve">39</w:t>
+            </w:r>
+          </w:p>
+        </w:tc>
+        <w:tc>
+          <w:tcPr>
+            <w:tcW w:type="dxa" w:w="2171"/>
+            <w:tcBorders>
+              <w:top w:val="single" w:color="D9D4C7" w:sz="4"/>
+              <w:left w:val="single" w:color="D9D4C7" w:sz="4"/>
+              <w:bottom w:val="single" w:color="D9D4C7" w:sz="4"/>
+              <w:right w:val="single" w:color="D9D4C7" w:sz="4"/>
+            </w:tcBorders>
+            <w:tcMar>
+              <w:top w:type="dxa" w:w="60"/>
+              <w:left w:type="dxa" w:w="100"/>
+              <w:bottom w:type="dxa" w:w="60"/>
+              <w:right w:type="dxa" w:w="100"/>
+            </w:tcMar>
+          </w:tcPr>
+          <w:p>
+            <w:pPr>
+              <w:spacing w:after="0"/>
+            </w:pPr>
+            <w:r>
+              <w:rPr>
+                <w:sz w:val="19"/>
+                <w:szCs w:val="19"/>
+              </w:rPr>
+              <w:t xml:space="preserve">Guides</w:t>
+            </w:r>
+          </w:p>
+        </w:tc>
+        <w:tc>
+          <w:tcPr>
+            <w:tcW w:type="dxa" w:w="6789"/>
+            <w:tcBorders>
+              <w:top w:val="single" w:color="D9D4C7" w:sz="4"/>
+              <w:left w:val="single" w:color="D9D4C7" w:sz="4"/>
+              <w:bottom w:val="single" w:color="D9D4C7" w:sz="4"/>
+              <w:right w:val="single" w:color="D9D4C7" w:sz="4"/>
+            </w:tcBorders>
+            <w:tcMar>
+              <w:top w:type="dxa" w:w="60"/>
+              <w:left w:type="dxa" w:w="100"/>
+              <w:bottom w:type="dxa" w:w="60"/>
+              <w:right w:type="dxa" w:w="100"/>
+            </w:tcMar>
+          </w:tcPr>
+          <w:p>
+            <w:pPr>
+              <w:spacing w:after="0"/>
+            </w:pPr>
+            <w:r>
+              <w:rPr>
+                <w:sz w:val="19"/>
+                <w:szCs w:val="19"/>
+              </w:rPr>
+              <w:t xml:space="preserve">(1) the complete guide for the whole app </w:t>
+            </w:r>
+            <w:r>
+              <w:rPr>
+                <w:rFonts w:ascii="Consolas" w:cs="Consolas" w:eastAsia="Consolas" w:hAnsi="Consolas"/>
+                <w:color w:val="6B4A12"/>
+                <w:sz w:val="19"/>
+                <w:szCs w:val="19"/>
+              </w:rPr>
+              <w:t xml:space="preserve">VODIC-SR</w:t>
+            </w:r>
+            <w:r>
+              <w:rPr>
+                <w:sz w:val="19"/>
+                <w:szCs w:val="19"/>
+              </w:rPr>
+              <w:t xml:space="preserve"> / </w:t>
+            </w:r>
+            <w:r>
+              <w:rPr>
+                <w:rFonts w:ascii="Consolas" w:cs="Consolas" w:eastAsia="Consolas" w:hAnsi="Consolas"/>
+                <w:color w:val="6B4A12"/>
+                <w:sz w:val="19"/>
+                <w:szCs w:val="19"/>
+              </w:rPr>
+              <w:t xml:space="preserve">GUIDE-EN</w:t>
+            </w:r>
+            <w:r>
+              <w:rPr>
+                <w:sz w:val="19"/>
+                <w:szCs w:val="19"/>
+              </w:rPr>
+              <w:t xml:space="preserve">, same content, for 0.3.0, in the package (md in the app "Help → Guide" + docx), written last from the installed version; the personal package adds "Your missions". (2) the install and live-test guide </w:t>
+            </w:r>
+            <w:r>
+              <w:rPr>
+                <w:rFonts w:ascii="Consolas" w:cs="Consolas" w:eastAsia="Consolas" w:hAnsi="Consolas"/>
+                <w:color w:val="6B4A12"/>
+                <w:sz w:val="19"/>
+                <w:szCs w:val="19"/>
+              </w:rPr>
+              <w:t xml:space="preserve">PSE Riemann — VODIC 0.3.0 INSTALACIJA I ZIVI TEST.docx</w:t>
+            </w:r>
+            <w:r>
+              <w:rPr>
+                <w:sz w:val="19"/>
+                <w:szCs w:val="19"/>
+              </w:rPr>
+              <w:t xml:space="preserve"> + EN, for Andrej only, not in the package</w:t>
+            </w:r>
+          </w:p>
+        </w:tc>
+      </w:tr>
+      <w:tr>
+        <w:trPr>
+          <w:tblHeader w:val="off"/>
+        </w:trPr>
+        <w:tc>
+          <w:tcPr>
+            <w:tcW w:type="dxa" w:w="678"/>
+            <w:tcBorders>
+              <w:top w:val="single" w:color="D9D4C7" w:sz="4"/>
+              <w:left w:val="single" w:color="D9D4C7" w:sz="4"/>
+              <w:bottom w:val="single" w:color="D9D4C7" w:sz="4"/>
+              <w:right w:val="single" w:color="D9D4C7" w:sz="4"/>
+            </w:tcBorders>
+            <w:shd w:fill="F4F1EA" w:color="auto" w:val="clear"/>
+            <w:tcMar>
+              <w:top w:type="dxa" w:w="60"/>
+              <w:left w:type="dxa" w:w="100"/>
+              <w:bottom w:type="dxa" w:w="60"/>
+              <w:right w:type="dxa" w:w="100"/>
+            </w:tcMar>
+          </w:tcPr>
+          <w:p>
+            <w:pPr>
+              <w:spacing w:after="0"/>
+            </w:pPr>
+            <w:r>
+              <w:rPr>
+                <w:sz w:val="19"/>
+                <w:szCs w:val="19"/>
+              </w:rPr>
+              <w:t xml:space="preserve">40</w:t>
+            </w:r>
+          </w:p>
+        </w:tc>
+        <w:tc>
+          <w:tcPr>
+            <w:tcW w:type="dxa" w:w="2171"/>
+            <w:tcBorders>
+              <w:top w:val="single" w:color="D9D4C7" w:sz="4"/>
+              <w:left w:val="single" w:color="D9D4C7" w:sz="4"/>
+              <w:bottom w:val="single" w:color="D9D4C7" w:sz="4"/>
+              <w:right w:val="single" w:color="D9D4C7" w:sz="4"/>
+            </w:tcBorders>
+            <w:shd w:fill="F4F1EA" w:color="auto" w:val="clear"/>
+            <w:tcMar>
+              <w:top w:type="dxa" w:w="60"/>
+              <w:left w:type="dxa" w:w="100"/>
+              <w:bottom w:type="dxa" w:w="60"/>
+              <w:right w:type="dxa" w:w="100"/>
+            </w:tcMar>
+          </w:tcPr>
+          <w:p>
+            <w:pPr>
+              <w:spacing w:after="0"/>
+            </w:pPr>
+            <w:r>
+              <w:rPr>
+                <w:sz w:val="19"/>
+                <w:szCs w:val="19"/>
+              </w:rPr>
+              <w:t xml:space="preserve">Calibration and lifespan</w:t>
+            </w:r>
+          </w:p>
+        </w:tc>
+        <w:tc>
+          <w:tcPr>
+            <w:tcW w:type="dxa" w:w="6789"/>
+            <w:tcBorders>
+              <w:top w:val="single" w:color="D9D4C7" w:sz="4"/>
+              <w:left w:val="single" w:color="D9D4C7" w:sz="4"/>
+              <w:bottom w:val="single" w:color="D9D4C7" w:sz="4"/>
+              <w:right w:val="single" w:color="D9D4C7" w:sz="4"/>
+            </w:tcBorders>
+            <w:shd w:fill="F4F1EA" w:color="auto" w:val="clear"/>
+            <w:tcMar>
+              <w:top w:type="dxa" w:w="60"/>
+              <w:left w:type="dxa" w:w="100"/>
+              <w:bottom w:type="dxa" w:w="60"/>
+              <w:right w:type="dxa" w:w="100"/>
+            </w:tcMar>
+          </w:tcPr>
+          <w:p>
+            <w:pPr>
+              <w:spacing w:after="0"/>
+            </w:pPr>
+            <w:r>
+              <w:rPr>
+                <w:sz w:val="19"/>
+                <w:szCs w:val="19"/>
+              </w:rPr>
+              <w:t xml:space="preserve">θ literally per move until the live test; N_max for chat and voice = 1000</w:t>
+            </w:r>
+          </w:p>
+        </w:tc>
+      </w:tr>
+      <w:tr>
+        <w:trPr>
+          <w:tblHeader w:val="off"/>
+        </w:trPr>
+        <w:tc>
+          <w:tcPr>
+            <w:tcW w:type="dxa" w:w="678"/>
+            <w:tcBorders>
+              <w:top w:val="single" w:color="D9D4C7" w:sz="4"/>
+              <w:left w:val="single" w:color="D9D4C7" w:sz="4"/>
+              <w:bottom w:val="single" w:color="D9D4C7" w:sz="4"/>
+              <w:right w:val="single" w:color="D9D4C7" w:sz="4"/>
+            </w:tcBorders>
+            <w:tcMar>
+              <w:top w:type="dxa" w:w="60"/>
+              <w:left w:type="dxa" w:w="100"/>
+              <w:bottom w:type="dxa" w:w="60"/>
+              <w:right w:type="dxa" w:w="100"/>
+            </w:tcMar>
+          </w:tcPr>
+          <w:p>
+            <w:pPr>
+              <w:spacing w:after="0"/>
+            </w:pPr>
+            <w:r>
+              <w:rPr>
+                <w:sz w:val="19"/>
+                <w:szCs w:val="19"/>
+              </w:rPr>
+              <w:t xml:space="preserve">41</w:t>
+            </w:r>
+          </w:p>
+        </w:tc>
+        <w:tc>
+          <w:tcPr>
+            <w:tcW w:type="dxa" w:w="2171"/>
+            <w:tcBorders>
+              <w:top w:val="single" w:color="D9D4C7" w:sz="4"/>
+              <w:left w:val="single" w:color="D9D4C7" w:sz="4"/>
+              <w:bottom w:val="single" w:color="D9D4C7" w:sz="4"/>
+              <w:right w:val="single" w:color="D9D4C7" w:sz="4"/>
+            </w:tcBorders>
+            <w:tcMar>
+              <w:top w:type="dxa" w:w="60"/>
+              <w:left w:type="dxa" w:w="100"/>
+              <w:bottom w:type="dxa" w:w="60"/>
+              <w:right w:type="dxa" w:w="100"/>
+            </w:tcMar>
+          </w:tcPr>
+          <w:p>
+            <w:pPr>
+              <w:spacing w:after="0"/>
+            </w:pPr>
+            <w:r>
+              <w:rPr>
+                <w:sz w:val="19"/>
+                <w:szCs w:val="19"/>
+              </w:rPr>
+              <w:t xml:space="preserve">Way of working</w:t>
+            </w:r>
+          </w:p>
+        </w:tc>
+        <w:tc>
+          <w:tcPr>
+            <w:tcW w:type="dxa" w:w="6789"/>
+            <w:tcBorders>
+              <w:top w:val="single" w:color="D9D4C7" w:sz="4"/>
+              <w:left w:val="single" w:color="D9D4C7" w:sz="4"/>
+              <w:bottom w:val="single" w:color="D9D4C7" w:sz="4"/>
+              <w:right w:val="single" w:color="D9D4C7" w:sz="4"/>
+            </w:tcBorders>
+            <w:tcMar>
+              <w:top w:type="dxa" w:w="60"/>
+              <w:left w:type="dxa" w:w="100"/>
+              <w:bottom w:type="dxa" w:w="60"/>
+              <w:right w:type="dxa" w:w="100"/>
+            </w:tcMar>
+          </w:tcPr>
+          <w:p>
+            <w:pPr>
+              <w:spacing w:after="0"/>
+            </w:pPr>
+            <w:r>
+              <w:rPr>
+                <w:sz w:val="19"/>
+                <w:szCs w:val="19"/>
+              </w:rPr>
+              <w:t xml:space="preserve">Andrej sleeps: I do everything in the plan without asking; commits local; at the end a list of commits to approve + what I could not do (</w:t>
+            </w:r>
+            <w:r>
+              <w:rPr>
+                <w:rFonts w:ascii="Consolas" w:cs="Consolas" w:eastAsia="Consolas" w:hAnsi="Consolas"/>
+                <w:color w:val="6B4A12"/>
+                <w:sz w:val="19"/>
+                <w:szCs w:val="19"/>
+              </w:rPr>
+              <w:t xml:space="preserve">ZA-ANDREJA.md</w:t>
+            </w:r>
+            <w:r>
+              <w:rPr>
+                <w:sz w:val="19"/>
+                <w:szCs w:val="19"/>
+              </w:rPr>
+              <w:t xml:space="preserve">)</w:t>
+            </w:r>
+          </w:p>
+        </w:tc>
+      </w:tr>
+    </w:tbl>
+    <w:p>
+      <w:pPr>
+        <w:spacing w:after="120"/>
+      </w:pPr>
     </w:p>
     <w:sectPr>
       <w:footerReference w:type="default" r:id="rId6"/>

</xml_diff>

<commit_message>
Dogovor treća runda (pravila 42–49) i plan R9–R14 za 0.3.0~rc2 (SR + EN, docx)
Co-Authored-By: Claude Opus 5.5 <noreply@anthropic.com>
</commit_message>
<xml_diff>
--- a/PSE Riemann — AGREEMENT PSE AGENTS.docx
+++ b/PSE Riemann — AGREEMENT PSE AGENTS.docx
@@ -6682,6 +6682,985 @@
                 <w:szCs w:val="19"/>
               </w:rPr>
               <w:t xml:space="preserve">)</w:t>
+            </w:r>
+          </w:p>
+        </w:tc>
+      </w:tr>
+    </w:tbl>
+    <w:p>
+      <w:pPr>
+        <w:spacing w:after="120"/>
+      </w:pPr>
+    </w:p>
+    <w:p>
+      <w:pPr>
+        <w:pStyle w:val="Heading1"/>
+      </w:pPr>
+      <w:r>
+        <w:t xml:space="preserve">8. Agreement, third round (2026-10-27, after the first live test): rc2</w:t>
+      </w:r>
+    </w:p>
+    <w:tbl>
+      <w:tblPr>
+        <w:tblW w:type="dxa" w:w="9638"/>
+        <w:tblBorders>
+          <w:top w:val="single" w:color="auto" w:sz="4"/>
+          <w:left w:val="single" w:color="auto" w:sz="4"/>
+          <w:bottom w:val="single" w:color="auto" w:sz="4"/>
+          <w:right w:val="single" w:color="auto" w:sz="4"/>
+          <w:insideH w:val="single" w:color="auto" w:sz="4"/>
+          <w:insideV w:val="single" w:color="auto" w:sz="4"/>
+        </w:tblBorders>
+      </w:tblPr>
+      <w:tblGrid>
+        <w:gridCol w:w="678"/>
+        <w:gridCol w:w="2171"/>
+        <w:gridCol w:w="6789"/>
+      </w:tblGrid>
+      <w:tr>
+        <w:trPr>
+          <w:tblHeader/>
+        </w:trPr>
+        <w:tc>
+          <w:tcPr>
+            <w:tcW w:type="dxa" w:w="678"/>
+            <w:tcBorders>
+              <w:top w:val="single" w:color="D9D4C7" w:sz="4"/>
+              <w:left w:val="single" w:color="D9D4C7" w:sz="4"/>
+              <w:bottom w:val="single" w:color="D9D4C7" w:sz="4"/>
+              <w:right w:val="single" w:color="D9D4C7" w:sz="4"/>
+            </w:tcBorders>
+            <w:shd w:fill="1F2430" w:color="auto" w:val="clear"/>
+            <w:tcMar>
+              <w:top w:type="dxa" w:w="60"/>
+              <w:left w:type="dxa" w:w="100"/>
+              <w:bottom w:type="dxa" w:w="60"/>
+              <w:right w:type="dxa" w:w="100"/>
+            </w:tcMar>
+          </w:tcPr>
+          <w:p>
+            <w:pPr>
+              <w:spacing w:after="0"/>
+            </w:pPr>
+            <w:r>
+              <w:rPr>
+                <w:b/>
+                <w:bCs/>
+                <w:color w:val="FFFFFF"/>
+                <w:sz w:val="19"/>
+                <w:szCs w:val="19"/>
+              </w:rPr>
+              <w:t xml:space="preserve">#</w:t>
+            </w:r>
+          </w:p>
+        </w:tc>
+        <w:tc>
+          <w:tcPr>
+            <w:tcW w:type="dxa" w:w="2171"/>
+            <w:tcBorders>
+              <w:top w:val="single" w:color="D9D4C7" w:sz="4"/>
+              <w:left w:val="single" w:color="D9D4C7" w:sz="4"/>
+              <w:bottom w:val="single" w:color="D9D4C7" w:sz="4"/>
+              <w:right w:val="single" w:color="D9D4C7" w:sz="4"/>
+            </w:tcBorders>
+            <w:shd w:fill="1F2430" w:color="auto" w:val="clear"/>
+            <w:tcMar>
+              <w:top w:type="dxa" w:w="60"/>
+              <w:left w:type="dxa" w:w="100"/>
+              <w:bottom w:type="dxa" w:w="60"/>
+              <w:right w:type="dxa" w:w="100"/>
+            </w:tcMar>
+          </w:tcPr>
+          <w:p>
+            <w:pPr>
+              <w:spacing w:after="0"/>
+            </w:pPr>
+            <w:r>
+              <w:rPr>
+                <w:b/>
+                <w:bCs/>
+                <w:color w:val="FFFFFF"/>
+                <w:sz w:val="19"/>
+                <w:szCs w:val="19"/>
+              </w:rPr>
+              <w:t xml:space="preserve">Topic</w:t>
+            </w:r>
+          </w:p>
+        </w:tc>
+        <w:tc>
+          <w:tcPr>
+            <w:tcW w:type="dxa" w:w="6789"/>
+            <w:tcBorders>
+              <w:top w:val="single" w:color="D9D4C7" w:sz="4"/>
+              <w:left w:val="single" w:color="D9D4C7" w:sz="4"/>
+              <w:bottom w:val="single" w:color="D9D4C7" w:sz="4"/>
+              <w:right w:val="single" w:color="D9D4C7" w:sz="4"/>
+            </w:tcBorders>
+            <w:shd w:fill="1F2430" w:color="auto" w:val="clear"/>
+            <w:tcMar>
+              <w:top w:type="dxa" w:w="60"/>
+              <w:left w:type="dxa" w:w="100"/>
+              <w:bottom w:type="dxa" w:w="60"/>
+              <w:right w:type="dxa" w:w="100"/>
+            </w:tcMar>
+          </w:tcPr>
+          <w:p>
+            <w:pPr>
+              <w:spacing w:after="0"/>
+            </w:pPr>
+            <w:r>
+              <w:rPr>
+                <w:b/>
+                <w:bCs/>
+                <w:color w:val="FFFFFF"/>
+                <w:sz w:val="19"/>
+                <w:szCs w:val="19"/>
+              </w:rPr>
+              <w:t xml:space="preserve">Agreement</w:t>
+            </w:r>
+          </w:p>
+        </w:tc>
+      </w:tr>
+      <w:tr>
+        <w:trPr>
+          <w:tblHeader w:val="off"/>
+        </w:trPr>
+        <w:tc>
+          <w:tcPr>
+            <w:tcW w:type="dxa" w:w="678"/>
+            <w:tcBorders>
+              <w:top w:val="single" w:color="D9D4C7" w:sz="4"/>
+              <w:left w:val="single" w:color="D9D4C7" w:sz="4"/>
+              <w:bottom w:val="single" w:color="D9D4C7" w:sz="4"/>
+              <w:right w:val="single" w:color="D9D4C7" w:sz="4"/>
+            </w:tcBorders>
+            <w:tcMar>
+              <w:top w:type="dxa" w:w="60"/>
+              <w:left w:type="dxa" w:w="100"/>
+              <w:bottom w:type="dxa" w:w="60"/>
+              <w:right w:type="dxa" w:w="100"/>
+            </w:tcMar>
+          </w:tcPr>
+          <w:p>
+            <w:pPr>
+              <w:spacing w:after="0"/>
+            </w:pPr>
+            <w:r>
+              <w:rPr>
+                <w:sz w:val="19"/>
+                <w:szCs w:val="19"/>
+              </w:rPr>
+              <w:t xml:space="preserve">42</w:t>
+            </w:r>
+          </w:p>
+        </w:tc>
+        <w:tc>
+          <w:tcPr>
+            <w:tcW w:type="dxa" w:w="2171"/>
+            <w:tcBorders>
+              <w:top w:val="single" w:color="D9D4C7" w:sz="4"/>
+              <w:left w:val="single" w:color="D9D4C7" w:sz="4"/>
+              <w:bottom w:val="single" w:color="D9D4C7" w:sz="4"/>
+              <w:right w:val="single" w:color="D9D4C7" w:sz="4"/>
+            </w:tcBorders>
+            <w:tcMar>
+              <w:top w:type="dxa" w:w="60"/>
+              <w:left w:type="dxa" w:w="100"/>
+              <w:bottom w:type="dxa" w:w="60"/>
+              <w:right w:type="dxa" w:w="100"/>
+            </w:tcMar>
+          </w:tcPr>
+          <w:p>
+            <w:pPr>
+              <w:spacing w:after="0"/>
+            </w:pPr>
+            <w:r>
+              <w:rPr>
+                <w:sz w:val="19"/>
+                <w:szCs w:val="19"/>
+              </w:rPr>
+              <w:t xml:space="preserve">The Missions tab = a workspace</w:t>
+            </w:r>
+          </w:p>
+        </w:tc>
+        <w:tc>
+          <w:tcPr>
+            <w:tcW w:type="dxa" w:w="6789"/>
+            <w:tcBorders>
+              <w:top w:val="single" w:color="D9D4C7" w:sz="4"/>
+              <w:left w:val="single" w:color="D9D4C7" w:sz="4"/>
+              <w:bottom w:val="single" w:color="D9D4C7" w:sz="4"/>
+              <w:right w:val="single" w:color="D9D4C7" w:sz="4"/>
+            </w:tcBorders>
+            <w:tcMar>
+              <w:top w:type="dxa" w:w="60"/>
+              <w:left w:type="dxa" w:w="100"/>
+              <w:bottom w:type="dxa" w:w="60"/>
+              <w:right w:type="dxa" w:w="100"/>
+            </w:tcMar>
+          </w:tcPr>
+          <w:p>
+            <w:pPr>
+              <w:spacing w:after="0"/>
+            </w:pPr>
+            <w:r>
+              <w:rPr>
+                <w:sz w:val="19"/>
+                <w:szCs w:val="19"/>
+              </w:rPr>
+              <w:t xml:space="preserve">layout A: </w:t>
+            </w:r>
+            <w:r>
+              <w:rPr>
+                <w:b/>
+                <w:bCs/>
+                <w:sz w:val="19"/>
+                <w:szCs w:val="19"/>
+              </w:rPr>
+              <w:t xml:space="preserve">left</w:t>
+            </w:r>
+            <w:r>
+              <w:rPr>
+                <w:sz w:val="19"/>
+                <w:szCs w:val="19"/>
+              </w:rPr>
+              <w:t xml:space="preserve"> the missions as cards (title, short state, frontier, number of papers, number of waiting items) + "+ New mission"; </w:t>
+            </w:r>
+            <w:r>
+              <w:rPr>
+                <w:b/>
+                <w:bCs/>
+                <w:sz w:val="19"/>
+                <w:szCs w:val="19"/>
+              </w:rPr>
+              <w:t xml:space="preserve">right top</w:t>
+            </w:r>
+            <w:r>
+              <w:rPr>
+                <w:sz w:val="19"/>
+                <w:szCs w:val="19"/>
+              </w:rPr>
+              <w:t xml:space="preserve"> the selected mission's details (question, state, goal, latest steps, "where you left off") and its buttons (Activate, Leave for later, Close the mission); </w:t>
+            </w:r>
+            <w:r>
+              <w:rPr>
+                <w:b/>
+                <w:bCs/>
+                <w:sz w:val="19"/>
+                <w:szCs w:val="19"/>
+              </w:rPr>
+              <w:t xml:space="preserve">right bottom</w:t>
+            </w:r>
+            <w:r>
+              <w:rPr>
+                <w:sz w:val="19"/>
+                <w:szCs w:val="19"/>
+              </w:rPr>
+              <w:t xml:space="preserve"> a collapsible papers strip ("N of M selected ▾") and the conversation; the top/bottom border can be dragged. The top of the tab keeps what applies to all missions (Check arXiv, Adversarial mode, Working paper, Export report)</w:t>
+            </w:r>
+          </w:p>
+        </w:tc>
+      </w:tr>
+      <w:tr>
+        <w:trPr>
+          <w:tblHeader w:val="off"/>
+        </w:trPr>
+        <w:tc>
+          <w:tcPr>
+            <w:tcW w:type="dxa" w:w="678"/>
+            <w:tcBorders>
+              <w:top w:val="single" w:color="D9D4C7" w:sz="4"/>
+              <w:left w:val="single" w:color="D9D4C7" w:sz="4"/>
+              <w:bottom w:val="single" w:color="D9D4C7" w:sz="4"/>
+              <w:right w:val="single" w:color="D9D4C7" w:sz="4"/>
+            </w:tcBorders>
+            <w:shd w:fill="F4F1EA" w:color="auto" w:val="clear"/>
+            <w:tcMar>
+              <w:top w:type="dxa" w:w="60"/>
+              <w:left w:type="dxa" w:w="100"/>
+              <w:bottom w:type="dxa" w:w="60"/>
+              <w:right w:type="dxa" w:w="100"/>
+            </w:tcMar>
+          </w:tcPr>
+          <w:p>
+            <w:pPr>
+              <w:spacing w:after="0"/>
+            </w:pPr>
+            <w:r>
+              <w:rPr>
+                <w:sz w:val="19"/>
+                <w:szCs w:val="19"/>
+              </w:rPr>
+              <w:t xml:space="preserve">43</w:t>
+            </w:r>
+          </w:p>
+        </w:tc>
+        <w:tc>
+          <w:tcPr>
+            <w:tcW w:type="dxa" w:w="2171"/>
+            <w:tcBorders>
+              <w:top w:val="single" w:color="D9D4C7" w:sz="4"/>
+              <w:left w:val="single" w:color="D9D4C7" w:sz="4"/>
+              <w:bottom w:val="single" w:color="D9D4C7" w:sz="4"/>
+              <w:right w:val="single" w:color="D9D4C7" w:sz="4"/>
+            </w:tcBorders>
+            <w:shd w:fill="F4F1EA" w:color="auto" w:val="clear"/>
+            <w:tcMar>
+              <w:top w:type="dxa" w:w="60"/>
+              <w:left w:type="dxa" w:w="100"/>
+              <w:bottom w:type="dxa" w:w="60"/>
+              <w:right w:type="dxa" w:w="100"/>
+            </w:tcMar>
+          </w:tcPr>
+          <w:p>
+            <w:pPr>
+              <w:spacing w:after="0"/>
+            </w:pPr>
+            <w:r>
+              <w:rPr>
+                <w:sz w:val="19"/>
+                <w:szCs w:val="19"/>
+              </w:rPr>
+              <w:t xml:space="preserve">Start of the conversation</w:t>
+            </w:r>
+          </w:p>
+        </w:tc>
+        <w:tc>
+          <w:tcPr>
+            <w:tcW w:type="dxa" w:w="6789"/>
+            <w:tcBorders>
+              <w:top w:val="single" w:color="D9D4C7" w:sz="4"/>
+              <w:left w:val="single" w:color="D9D4C7" w:sz="4"/>
+              <w:bottom w:val="single" w:color="D9D4C7" w:sz="4"/>
+              <w:right w:val="single" w:color="D9D4C7" w:sz="4"/>
+            </w:tcBorders>
+            <w:shd w:fill="F4F1EA" w:color="auto" w:val="clear"/>
+            <w:tcMar>
+              <w:top w:type="dxa" w:w="60"/>
+              <w:left w:type="dxa" w:w="100"/>
+              <w:bottom w:type="dxa" w:w="60"/>
+              <w:right w:type="dxa" w:w="100"/>
+            </w:tcMar>
+          </w:tcPr>
+          <w:p>
+            <w:pPr>
+              <w:spacing w:after="0"/>
+            </w:pPr>
+            <w:r>
+              <w:rPr>
+                <w:sz w:val="19"/>
+                <w:szCs w:val="19"/>
+              </w:rPr>
+              <w:t xml:space="preserve">clicking a mission starts the mission agent at once: it reads the mission's state, the memory of the last session and the papers, writes the first message (what it sees, where you left off, ≤ 3 questions) and waits for the user. The first call costs</w:t>
+            </w:r>
+          </w:p>
+        </w:tc>
+      </w:tr>
+      <w:tr>
+        <w:trPr>
+          <w:tblHeader w:val="off"/>
+        </w:trPr>
+        <w:tc>
+          <w:tcPr>
+            <w:tcW w:type="dxa" w:w="678"/>
+            <w:tcBorders>
+              <w:top w:val="single" w:color="D9D4C7" w:sz="4"/>
+              <w:left w:val="single" w:color="D9D4C7" w:sz="4"/>
+              <w:bottom w:val="single" w:color="D9D4C7" w:sz="4"/>
+              <w:right w:val="single" w:color="D9D4C7" w:sz="4"/>
+            </w:tcBorders>
+            <w:tcMar>
+              <w:top w:type="dxa" w:w="60"/>
+              <w:left w:type="dxa" w:w="100"/>
+              <w:bottom w:type="dxa" w:w="60"/>
+              <w:right w:type="dxa" w:w="100"/>
+            </w:tcMar>
+          </w:tcPr>
+          <w:p>
+            <w:pPr>
+              <w:spacing w:after="0"/>
+            </w:pPr>
+            <w:r>
+              <w:rPr>
+                <w:sz w:val="19"/>
+                <w:szCs w:val="19"/>
+              </w:rPr>
+              <w:t xml:space="preserve">44</w:t>
+            </w:r>
+          </w:p>
+        </w:tc>
+        <w:tc>
+          <w:tcPr>
+            <w:tcW w:type="dxa" w:w="2171"/>
+            <w:tcBorders>
+              <w:top w:val="single" w:color="D9D4C7" w:sz="4"/>
+              <w:left w:val="single" w:color="D9D4C7" w:sz="4"/>
+              <w:bottom w:val="single" w:color="D9D4C7" w:sz="4"/>
+              <w:right w:val="single" w:color="D9D4C7" w:sz="4"/>
+            </w:tcBorders>
+            <w:tcMar>
+              <w:top w:type="dxa" w:w="60"/>
+              <w:left w:type="dxa" w:w="100"/>
+              <w:bottom w:type="dxa" w:w="60"/>
+              <w:right w:type="dxa" w:w="100"/>
+            </w:tcMar>
+          </w:tcPr>
+          <w:p>
+            <w:pPr>
+              <w:spacing w:after="0"/>
+            </w:pPr>
+            <w:r>
+              <w:rPr>
+                <w:sz w:val="19"/>
+                <w:szCs w:val="19"/>
+              </w:rPr>
+              <w:t xml:space="preserve">What the agent reads</w:t>
+            </w:r>
+          </w:p>
+        </w:tc>
+        <w:tc>
+          <w:tcPr>
+            <w:tcW w:type="dxa" w:w="6789"/>
+            <w:tcBorders>
+              <w:top w:val="single" w:color="D9D4C7" w:sz="4"/>
+              <w:left w:val="single" w:color="D9D4C7" w:sz="4"/>
+              <w:bottom w:val="single" w:color="D9D4C7" w:sz="4"/>
+              <w:right w:val="single" w:color="D9D4C7" w:sz="4"/>
+            </w:tcBorders>
+            <w:tcMar>
+              <w:top w:type="dxa" w:w="60"/>
+              <w:left w:type="dxa" w:w="100"/>
+              <w:bottom w:type="dxa" w:w="60"/>
+              <w:right w:type="dxa" w:w="100"/>
+            </w:tcMar>
+          </w:tcPr>
+          <w:p>
+            <w:pPr>
+              <w:spacing w:after="0"/>
+            </w:pPr>
+            <w:r>
+              <w:rPr>
+                <w:sz w:val="19"/>
+                <w:szCs w:val="19"/>
+              </w:rPr>
+              <w:t xml:space="preserve">the first time: every paper of the mission (abstracts); afterwards: the papers chosen in the last session + new papers since then (marked "new") + </w:t>
+            </w:r>
+            <w:r>
+              <w:rPr>
+                <w:b/>
+                <w:bCs/>
+                <w:sz w:val="19"/>
+                <w:szCs w:val="19"/>
+              </w:rPr>
+              <w:t xml:space="preserve">anything the user tells it to read</w:t>
+            </w:r>
+            <w:r>
+              <w:rPr>
+                <w:sz w:val="19"/>
+                <w:szCs w:val="19"/>
+              </w:rPr>
+              <w:t xml:space="preserve"> (a paper from the list, an arXiv full text, a card, a report, a note)</w:t>
+            </w:r>
+          </w:p>
+        </w:tc>
+      </w:tr>
+      <w:tr>
+        <w:trPr>
+          <w:tblHeader w:val="off"/>
+        </w:trPr>
+        <w:tc>
+          <w:tcPr>
+            <w:tcW w:type="dxa" w:w="678"/>
+            <w:tcBorders>
+              <w:top w:val="single" w:color="D9D4C7" w:sz="4"/>
+              <w:left w:val="single" w:color="D9D4C7" w:sz="4"/>
+              <w:bottom w:val="single" w:color="D9D4C7" w:sz="4"/>
+              <w:right w:val="single" w:color="D9D4C7" w:sz="4"/>
+            </w:tcBorders>
+            <w:shd w:fill="F4F1EA" w:color="auto" w:val="clear"/>
+            <w:tcMar>
+              <w:top w:type="dxa" w:w="60"/>
+              <w:left w:type="dxa" w:w="100"/>
+              <w:bottom w:type="dxa" w:w="60"/>
+              <w:right w:type="dxa" w:w="100"/>
+            </w:tcMar>
+          </w:tcPr>
+          <w:p>
+            <w:pPr>
+              <w:spacing w:after="0"/>
+            </w:pPr>
+            <w:r>
+              <w:rPr>
+                <w:sz w:val="19"/>
+                <w:szCs w:val="19"/>
+              </w:rPr>
+              <w:t xml:space="preserve">45</w:t>
+            </w:r>
+          </w:p>
+        </w:tc>
+        <w:tc>
+          <w:tcPr>
+            <w:tcW w:type="dxa" w:w="2171"/>
+            <w:tcBorders>
+              <w:top w:val="single" w:color="D9D4C7" w:sz="4"/>
+              <w:left w:val="single" w:color="D9D4C7" w:sz="4"/>
+              <w:bottom w:val="single" w:color="D9D4C7" w:sz="4"/>
+              <w:right w:val="single" w:color="D9D4C7" w:sz="4"/>
+            </w:tcBorders>
+            <w:shd w:fill="F4F1EA" w:color="auto" w:val="clear"/>
+            <w:tcMar>
+              <w:top w:type="dxa" w:w="60"/>
+              <w:left w:type="dxa" w:w="100"/>
+              <w:bottom w:type="dxa" w:w="60"/>
+              <w:right w:type="dxa" w:w="100"/>
+            </w:tcMar>
+          </w:tcPr>
+          <w:p>
+            <w:pPr>
+              <w:spacing w:after="0"/>
+            </w:pPr>
+            <w:r>
+              <w:rPr>
+                <w:sz w:val="19"/>
+                <w:szCs w:val="19"/>
+              </w:rPr>
+              <w:t xml:space="preserve">Mission memory</w:t>
+            </w:r>
+          </w:p>
+        </w:tc>
+        <w:tc>
+          <w:tcPr>
+            <w:tcW w:type="dxa" w:w="6789"/>
+            <w:tcBorders>
+              <w:top w:val="single" w:color="D9D4C7" w:sz="4"/>
+              <w:left w:val="single" w:color="D9D4C7" w:sz="4"/>
+              <w:bottom w:val="single" w:color="D9D4C7" w:sz="4"/>
+              <w:right w:val="single" w:color="D9D4C7" w:sz="4"/>
+            </w:tcBorders>
+            <w:shd w:fill="F4F1EA" w:color="auto" w:val="clear"/>
+            <w:tcMar>
+              <w:top w:type="dxa" w:w="60"/>
+              <w:left w:type="dxa" w:w="100"/>
+              <w:bottom w:type="dxa" w:w="60"/>
+              <w:right w:type="dxa" w:w="100"/>
+            </w:tcMar>
+          </w:tcPr>
+          <w:p>
+            <w:pPr>
+              <w:spacing w:after="0"/>
+            </w:pPr>
+            <w:r>
+              <w:rPr>
+                <w:sz w:val="19"/>
+                <w:szCs w:val="19"/>
+              </w:rPr>
+              <w:t xml:space="preserve">only </w:t>
+            </w:r>
+            <w:r>
+              <w:rPr>
+                <w:b/>
+                <w:bCs/>
+                <w:sz w:val="19"/>
+                <w:szCs w:val="19"/>
+              </w:rPr>
+              <w:t xml:space="preserve">what matters</w:t>
+            </w:r>
+            <w:r>
+              <w:rPr>
+                <w:sz w:val="19"/>
+                <w:szCs w:val="19"/>
+              </w:rPr>
+              <w:t xml:space="preserve"> carries over to the next session, not the old conversation: what was decided / agreed, what was established (with a source), open questions, the agreed next step. The agent </w:t>
+            </w:r>
+            <w:r>
+              <w:rPr>
+                <w:b/>
+                <w:bCs/>
+                <w:sz w:val="19"/>
+                <w:szCs w:val="19"/>
+              </w:rPr>
+              <w:t xml:space="preserve">proposes</w:t>
+            </w:r>
+            <w:r>
+              <w:rPr>
+                <w:sz w:val="19"/>
+                <w:szCs w:val="19"/>
+              </w:rPr>
+              <w:t xml:space="preserve"> the items at the end of a session (End the conversation, switching to another mission, closing the app); the user ticks, deletes or adds items in the workspace → "Save memory". Without a decision the agent's proposal is kept, marked "unreviewed". The whole conversation is still saved in the results (OURS-UNREVIEWED), but the agent no longer reads it</w:t>
+            </w:r>
+          </w:p>
+        </w:tc>
+      </w:tr>
+      <w:tr>
+        <w:trPr>
+          <w:tblHeader w:val="off"/>
+        </w:trPr>
+        <w:tc>
+          <w:tcPr>
+            <w:tcW w:type="dxa" w:w="678"/>
+            <w:tcBorders>
+              <w:top w:val="single" w:color="D9D4C7" w:sz="4"/>
+              <w:left w:val="single" w:color="D9D4C7" w:sz="4"/>
+              <w:bottom w:val="single" w:color="D9D4C7" w:sz="4"/>
+              <w:right w:val="single" w:color="D9D4C7" w:sz="4"/>
+            </w:tcBorders>
+            <w:tcMar>
+              <w:top w:type="dxa" w:w="60"/>
+              <w:left w:type="dxa" w:w="100"/>
+              <w:bottom w:type="dxa" w:w="60"/>
+              <w:right w:type="dxa" w:w="100"/>
+            </w:tcMar>
+          </w:tcPr>
+          <w:p>
+            <w:pPr>
+              <w:spacing w:after="0"/>
+            </w:pPr>
+            <w:r>
+              <w:rPr>
+                <w:sz w:val="19"/>
+                <w:szCs w:val="19"/>
+              </w:rPr>
+              <w:t xml:space="preserve">46</w:t>
+            </w:r>
+          </w:p>
+        </w:tc>
+        <w:tc>
+          <w:tcPr>
+            <w:tcW w:type="dxa" w:w="2171"/>
+            <w:tcBorders>
+              <w:top w:val="single" w:color="D9D4C7" w:sz="4"/>
+              <w:left w:val="single" w:color="D9D4C7" w:sz="4"/>
+              <w:bottom w:val="single" w:color="D9D4C7" w:sz="4"/>
+              <w:right w:val="single" w:color="D9D4C7" w:sz="4"/>
+            </w:tcBorders>
+            <w:tcMar>
+              <w:top w:type="dxa" w:w="60"/>
+              <w:left w:type="dxa" w:w="100"/>
+              <w:bottom w:type="dxa" w:w="60"/>
+              <w:right w:type="dxa" w:w="100"/>
+            </w:tcMar>
+          </w:tcPr>
+          <w:p>
+            <w:pPr>
+              <w:spacing w:after="0"/>
+            </w:pPr>
+            <w:r>
+              <w:rPr>
+                <w:sz w:val="19"/>
+                <w:szCs w:val="19"/>
+              </w:rPr>
+              <w:t xml:space="preserve">Memory and "Where you left off"</w:t>
+            </w:r>
+          </w:p>
+        </w:tc>
+        <w:tc>
+          <w:tcPr>
+            <w:tcW w:type="dxa" w:w="6789"/>
+            <w:tcBorders>
+              <w:top w:val="single" w:color="D9D4C7" w:sz="4"/>
+              <w:left w:val="single" w:color="D9D4C7" w:sz="4"/>
+              <w:bottom w:val="single" w:color="D9D4C7" w:sz="4"/>
+              <w:right w:val="single" w:color="D9D4C7" w:sz="4"/>
+            </w:tcBorders>
+            <w:tcMar>
+              <w:top w:type="dxa" w:w="60"/>
+              <w:left w:type="dxa" w:w="100"/>
+              <w:bottom w:type="dxa" w:w="60"/>
+              <w:right w:type="dxa" w:w="100"/>
+            </w:tcMar>
+          </w:tcPr>
+          <w:p>
+            <w:pPr>
+              <w:spacing w:after="0"/>
+            </w:pPr>
+            <w:r>
+              <w:rPr>
+                <w:sz w:val="19"/>
+                <w:szCs w:val="19"/>
+              </w:rPr>
+              <w:t xml:space="preserve">side by side: the note is the user's, the memory is the agent's (reviewed by the user)</w:t>
+            </w:r>
+          </w:p>
+        </w:tc>
+      </w:tr>
+      <w:tr>
+        <w:trPr>
+          <w:tblHeader w:val="off"/>
+        </w:trPr>
+        <w:tc>
+          <w:tcPr>
+            <w:tcW w:type="dxa" w:w="678"/>
+            <w:tcBorders>
+              <w:top w:val="single" w:color="D9D4C7" w:sz="4"/>
+              <w:left w:val="single" w:color="D9D4C7" w:sz="4"/>
+              <w:bottom w:val="single" w:color="D9D4C7" w:sz="4"/>
+              <w:right w:val="single" w:color="D9D4C7" w:sz="4"/>
+            </w:tcBorders>
+            <w:shd w:fill="F4F1EA" w:color="auto" w:val="clear"/>
+            <w:tcMar>
+              <w:top w:type="dxa" w:w="60"/>
+              <w:left w:type="dxa" w:w="100"/>
+              <w:bottom w:type="dxa" w:w="60"/>
+              <w:right w:type="dxa" w:w="100"/>
+            </w:tcMar>
+          </w:tcPr>
+          <w:p>
+            <w:pPr>
+              <w:spacing w:after="0"/>
+            </w:pPr>
+            <w:r>
+              <w:rPr>
+                <w:sz w:val="19"/>
+                <w:szCs w:val="19"/>
+              </w:rPr>
+              <w:t xml:space="preserve">47</w:t>
+            </w:r>
+          </w:p>
+        </w:tc>
+        <w:tc>
+          <w:tcPr>
+            <w:tcW w:type="dxa" w:w="2171"/>
+            <w:tcBorders>
+              <w:top w:val="single" w:color="D9D4C7" w:sz="4"/>
+              <w:left w:val="single" w:color="D9D4C7" w:sz="4"/>
+              <w:bottom w:val="single" w:color="D9D4C7" w:sz="4"/>
+              <w:right w:val="single" w:color="D9D4C7" w:sz="4"/>
+            </w:tcBorders>
+            <w:shd w:fill="F4F1EA" w:color="auto" w:val="clear"/>
+            <w:tcMar>
+              <w:top w:type="dxa" w:w="60"/>
+              <w:left w:type="dxa" w:w="100"/>
+              <w:bottom w:type="dxa" w:w="60"/>
+              <w:right w:type="dxa" w:w="100"/>
+            </w:tcMar>
+          </w:tcPr>
+          <w:p>
+            <w:pPr>
+              <w:spacing w:after="0"/>
+            </w:pPr>
+            <w:r>
+              <w:rPr>
+                <w:sz w:val="19"/>
+                <w:szCs w:val="19"/>
+              </w:rPr>
+              <w:t xml:space="preserve">Mission names in the chat</w:t>
+            </w:r>
+          </w:p>
+        </w:tc>
+        <w:tc>
+          <w:tcPr>
+            <w:tcW w:type="dxa" w:w="6789"/>
+            <w:tcBorders>
+              <w:top w:val="single" w:color="D9D4C7" w:sz="4"/>
+              <w:left w:val="single" w:color="D9D4C7" w:sz="4"/>
+              <w:bottom w:val="single" w:color="D9D4C7" w:sz="4"/>
+              <w:right w:val="single" w:color="D9D4C7" w:sz="4"/>
+            </w:tcBorders>
+            <w:shd w:fill="F4F1EA" w:color="auto" w:val="clear"/>
+            <w:tcMar>
+              <w:top w:type="dxa" w:w="60"/>
+              <w:left w:type="dxa" w:w="100"/>
+              <w:bottom w:type="dxa" w:w="60"/>
+              <w:right w:type="dxa" w:w="100"/>
+            </w:tcMar>
+          </w:tcPr>
+          <w:p>
+            <w:pPr>
+              <w:spacing w:after="0"/>
+            </w:pPr>
+            <w:r>
+              <w:rPr>
+                <w:sz w:val="19"/>
+                <w:szCs w:val="19"/>
+              </w:rPr>
+              <w:t xml:space="preserve">the SHARED_LIB voice gives mission names as links that open that mission's workspace; a question that asks for judgement ("next step", "what should I do") → the voice says the database cannot answer that and gives the link "Talk about the mission: X"</w:t>
+            </w:r>
+          </w:p>
+        </w:tc>
+      </w:tr>
+      <w:tr>
+        <w:trPr>
+          <w:tblHeader w:val="off"/>
+        </w:trPr>
+        <w:tc>
+          <w:tcPr>
+            <w:tcW w:type="dxa" w:w="678"/>
+            <w:tcBorders>
+              <w:top w:val="single" w:color="D9D4C7" w:sz="4"/>
+              <w:left w:val="single" w:color="D9D4C7" w:sz="4"/>
+              <w:bottom w:val="single" w:color="D9D4C7" w:sz="4"/>
+              <w:right w:val="single" w:color="D9D4C7" w:sz="4"/>
+            </w:tcBorders>
+            <w:tcMar>
+              <w:top w:type="dxa" w:w="60"/>
+              <w:left w:type="dxa" w:w="100"/>
+              <w:bottom w:type="dxa" w:w="60"/>
+              <w:right w:type="dxa" w:w="100"/>
+            </w:tcMar>
+          </w:tcPr>
+          <w:p>
+            <w:pPr>
+              <w:spacing w:after="0"/>
+            </w:pPr>
+            <w:r>
+              <w:rPr>
+                <w:sz w:val="19"/>
+                <w:szCs w:val="19"/>
+              </w:rPr>
+              <w:t xml:space="preserve">48</w:t>
+            </w:r>
+          </w:p>
+        </w:tc>
+        <w:tc>
+          <w:tcPr>
+            <w:tcW w:type="dxa" w:w="2171"/>
+            <w:tcBorders>
+              <w:top w:val="single" w:color="D9D4C7" w:sz="4"/>
+              <w:left w:val="single" w:color="D9D4C7" w:sz="4"/>
+              <w:bottom w:val="single" w:color="D9D4C7" w:sz="4"/>
+              <w:right w:val="single" w:color="D9D4C7" w:sz="4"/>
+            </w:tcBorders>
+            <w:tcMar>
+              <w:top w:type="dxa" w:w="60"/>
+              <w:left w:type="dxa" w:w="100"/>
+              <w:bottom w:type="dxa" w:w="60"/>
+              <w:right w:type="dxa" w:w="100"/>
+            </w:tcMar>
+          </w:tcPr>
+          <w:p>
+            <w:pPr>
+              <w:spacing w:after="0"/>
+            </w:pPr>
+            <w:r>
+              <w:rPr>
+                <w:sz w:val="19"/>
+                <w:szCs w:val="19"/>
+              </w:rPr>
+              <w:t xml:space="preserve">Fixes (mandatory)</w:t>
+            </w:r>
+          </w:p>
+        </w:tc>
+        <w:tc>
+          <w:tcPr>
+            <w:tcW w:type="dxa" w:w="6789"/>
+            <w:tcBorders>
+              <w:top w:val="single" w:color="D9D4C7" w:sz="4"/>
+              <w:left w:val="single" w:color="D9D4C7" w:sz="4"/>
+              <w:bottom w:val="single" w:color="D9D4C7" w:sz="4"/>
+              <w:right w:val="single" w:color="D9D4C7" w:sz="4"/>
+            </w:tcBorders>
+            <w:tcMar>
+              <w:top w:type="dxa" w:w="60"/>
+              <w:left w:type="dxa" w:w="100"/>
+              <w:bottom w:type="dxa" w:w="60"/>
+              <w:right w:type="dxa" w:w="100"/>
+            </w:tcMar>
+          </w:tcPr>
+          <w:p>
+            <w:pPr>
+              <w:spacing w:after="0"/>
+            </w:pPr>
+            <w:r>
+              <w:rPr>
+                <w:sz w:val="19"/>
+                <w:szCs w:val="19"/>
+              </w:rPr>
+              <w:t xml:space="preserve">(a) Gemini 2.5: a thinking budget per role, output limit = answer + budget (thinking does not eat the answer); (b) a cut-off answer (all providers): one retry with a larger limit, and if it is cut again — the app says so; (c) invalid SQL in the voice: one retry with the error sent to the model, then a human sentence — never a raw error; (d) reader: a limit per model (200 + thinking budget); incomplete JSON → "reader cut off" visible in the Laboratory</w:t>
+            </w:r>
+          </w:p>
+        </w:tc>
+      </w:tr>
+      <w:tr>
+        <w:trPr>
+          <w:tblHeader w:val="off"/>
+        </w:trPr>
+        <w:tc>
+          <w:tcPr>
+            <w:tcW w:type="dxa" w:w="678"/>
+            <w:tcBorders>
+              <w:top w:val="single" w:color="D9D4C7" w:sz="4"/>
+              <w:left w:val="single" w:color="D9D4C7" w:sz="4"/>
+              <w:bottom w:val="single" w:color="D9D4C7" w:sz="4"/>
+              <w:right w:val="single" w:color="D9D4C7" w:sz="4"/>
+            </w:tcBorders>
+            <w:shd w:fill="F4F1EA" w:color="auto" w:val="clear"/>
+            <w:tcMar>
+              <w:top w:type="dxa" w:w="60"/>
+              <w:left w:type="dxa" w:w="100"/>
+              <w:bottom w:type="dxa" w:w="60"/>
+              <w:right w:type="dxa" w:w="100"/>
+            </w:tcMar>
+          </w:tcPr>
+          <w:p>
+            <w:pPr>
+              <w:spacing w:after="0"/>
+            </w:pPr>
+            <w:r>
+              <w:rPr>
+                <w:sz w:val="19"/>
+                <w:szCs w:val="19"/>
+              </w:rPr>
+              <w:t xml:space="preserve">49</w:t>
+            </w:r>
+          </w:p>
+        </w:tc>
+        <w:tc>
+          <w:tcPr>
+            <w:tcW w:type="dxa" w:w="2171"/>
+            <w:tcBorders>
+              <w:top w:val="single" w:color="D9D4C7" w:sz="4"/>
+              <w:left w:val="single" w:color="D9D4C7" w:sz="4"/>
+              <w:bottom w:val="single" w:color="D9D4C7" w:sz="4"/>
+              <w:right w:val="single" w:color="D9D4C7" w:sz="4"/>
+            </w:tcBorders>
+            <w:shd w:fill="F4F1EA" w:color="auto" w:val="clear"/>
+            <w:tcMar>
+              <w:top w:type="dxa" w:w="60"/>
+              <w:left w:type="dxa" w:w="100"/>
+              <w:bottom w:type="dxa" w:w="60"/>
+              <w:right w:type="dxa" w:w="100"/>
+            </w:tcMar>
+          </w:tcPr>
+          <w:p>
+            <w:pPr>
+              <w:spacing w:after="0"/>
+            </w:pPr>
+            <w:r>
+              <w:rPr>
+                <w:sz w:val="19"/>
+                <w:szCs w:val="19"/>
+              </w:rPr>
+              <w:t xml:space="preserve">Release</w:t>
+            </w:r>
+          </w:p>
+        </w:tc>
+        <w:tc>
+          <w:tcPr>
+            <w:tcW w:type="dxa" w:w="6789"/>
+            <w:tcBorders>
+              <w:top w:val="single" w:color="D9D4C7" w:sz="4"/>
+              <w:left w:val="single" w:color="D9D4C7" w:sz="4"/>
+              <w:bottom w:val="single" w:color="D9D4C7" w:sz="4"/>
+              <w:right w:val="single" w:color="D9D4C7" w:sz="4"/>
+            </w:tcBorders>
+            <w:shd w:fill="F4F1EA" w:color="auto" w:val="clear"/>
+            <w:tcMar>
+              <w:top w:type="dxa" w:w="60"/>
+              <w:left w:type="dxa" w:w="100"/>
+              <w:bottom w:type="dxa" w:w="60"/>
+              <w:right w:type="dxa" w:w="100"/>
+            </w:tcMar>
+          </w:tcPr>
+          <w:p>
+            <w:pPr>
+              <w:spacing w:after="0"/>
+            </w:pPr>
+            <w:r>
+              <w:rPr>
+                <w:sz w:val="19"/>
+                <w:szCs w:val="19"/>
+              </w:rPr>
+              <w:t xml:space="preserve">0.3.0~rc2, both packages (personal and public), guides updated, screenshots from the package</w:t>
             </w:r>
           </w:p>
         </w:tc>

</xml_diff>